<commit_message>
feat: Create Diagram IDEF0 AS-IS
</commit_message>
<xml_diff>
--- a/APO(Стройматерилов).docx
+++ b/APO(Стройматерилов).docx
@@ -666,6 +666,62 @@
       <w:pPr>
         <w:shd w:val="clear" w:color="auto" w:fill="FFFFFF"/>
         <w:spacing w:after="0" w:line="360" w:lineRule="auto"/>
+        <w:ind w:left="707" w:firstLine="709"/>
+        <w:contextualSpacing/>
+        <w:jc w:val="both"/>
+        <w:rPr>
+          <w:rFonts w:ascii="Times New Roman" w:eastAsia="Times New Roman" w:hAnsi="Times New Roman" w:cs="Times New Roman"/>
+          <w:color w:val="222222"/>
+          <w:sz w:val="28"/>
+          <w:szCs w:val="28"/>
+          <w:lang w:eastAsia="ru-RU"/>
+        </w:rPr>
+      </w:pPr>
+      <w:r>
+        <w:rPr>
+          <w:rFonts w:ascii="Times New Roman" w:eastAsia="Times New Roman" w:hAnsi="Times New Roman" w:cs="Times New Roman"/>
+          <w:color w:val="222222"/>
+          <w:sz w:val="28"/>
+          <w:szCs w:val="28"/>
+          <w:lang w:eastAsia="ru-RU"/>
+        </w:rPr>
+        <w:t xml:space="preserve">Инженер-сметчик – </w:t>
+      </w:r>
+      <w:r>
+        <w:rPr>
+          <w:rFonts w:ascii="Times New Roman" w:eastAsia="Times New Roman" w:hAnsi="Times New Roman" w:cs="Times New Roman"/>
+          <w:color w:val="222222"/>
+          <w:sz w:val="28"/>
+          <w:szCs w:val="28"/>
+          <w:lang w:eastAsia="ru-RU"/>
+        </w:rPr>
+        <w:t>расчет стоимости от</w:t>
+      </w:r>
+      <w:r>
+        <w:rPr>
+          <w:rFonts w:ascii="Times New Roman" w:eastAsia="Times New Roman" w:hAnsi="Times New Roman" w:cs="Times New Roman"/>
+          <w:color w:val="222222"/>
+          <w:sz w:val="28"/>
+          <w:szCs w:val="28"/>
+          <w:lang w:eastAsia="ru-RU"/>
+        </w:rPr>
+        <w:t>дельны</w:t>
+      </w:r>
+      <w:r>
+        <w:rPr>
+          <w:rFonts w:ascii="Times New Roman" w:eastAsia="Times New Roman" w:hAnsi="Times New Roman" w:cs="Times New Roman"/>
+          <w:color w:val="222222"/>
+          <w:sz w:val="28"/>
+          <w:szCs w:val="28"/>
+          <w:lang w:eastAsia="ru-RU"/>
+        </w:rPr>
+        <w:t>х работ, материалов, оборудования</w:t>
+      </w:r>
+    </w:p>
+    <w:p>
+      <w:pPr>
+        <w:shd w:val="clear" w:color="auto" w:fill="FFFFFF"/>
+        <w:spacing w:after="0" w:line="360" w:lineRule="auto"/>
         <w:ind w:firstLine="709"/>
         <w:contextualSpacing/>
         <w:jc w:val="both"/>
@@ -687,6 +743,7 @@
           <w:szCs w:val="28"/>
           <w:lang w:eastAsia="ru-RU"/>
         </w:rPr>
+        <w:lastRenderedPageBreak/>
         <w:t>1.3. Документы:</w:t>
       </w:r>
     </w:p>
@@ -764,55 +821,811 @@
           <w:szCs w:val="28"/>
           <w:lang w:eastAsia="ru-RU"/>
         </w:rPr>
+        <w:t>Внутренние:</w:t>
+      </w:r>
+      <w:r>
+        <w:rPr>
+          <w:rFonts w:ascii="Times New Roman" w:eastAsia="Times New Roman" w:hAnsi="Times New Roman" w:cs="Times New Roman"/>
+          <w:color w:val="222222"/>
+          <w:sz w:val="28"/>
+          <w:szCs w:val="28"/>
+          <w:lang w:eastAsia="ru-RU"/>
+        </w:rPr>
+        <w:t xml:space="preserve"> требование-накладная (М-11), акт списания, материальный отчёт, АПО.</w:t>
+      </w:r>
+    </w:p>
+    <w:p>
+      <w:pPr>
+        <w:shd w:val="clear" w:color="auto" w:fill="FFFFFF"/>
+        <w:spacing w:after="0" w:line="360" w:lineRule="auto"/>
+        <w:ind w:left="707" w:firstLine="709"/>
+        <w:contextualSpacing/>
+        <w:jc w:val="both"/>
+        <w:rPr>
+          <w:rFonts w:ascii="Times New Roman" w:eastAsia="Times New Roman" w:hAnsi="Times New Roman" w:cs="Times New Roman"/>
+          <w:color w:val="222222"/>
+          <w:sz w:val="28"/>
+          <w:szCs w:val="28"/>
+          <w:lang w:eastAsia="ru-RU"/>
+        </w:rPr>
+      </w:pPr>
+      <w:r>
+        <w:rPr>
+          <w:rFonts w:ascii="Times New Roman" w:eastAsia="Times New Roman" w:hAnsi="Times New Roman" w:cs="Times New Roman"/>
+          <w:b/>
+          <w:color w:val="222222"/>
+          <w:sz w:val="28"/>
+          <w:szCs w:val="28"/>
+          <w:lang w:eastAsia="ru-RU"/>
+        </w:rPr>
+        <w:t>Выходные</w:t>
+      </w:r>
+      <w:r>
+        <w:rPr>
+          <w:rFonts w:ascii="Times New Roman" w:eastAsia="Times New Roman" w:hAnsi="Times New Roman" w:cs="Times New Roman"/>
+          <w:color w:val="222222"/>
+          <w:sz w:val="28"/>
+          <w:szCs w:val="28"/>
+          <w:lang w:eastAsia="ru-RU"/>
+        </w:rPr>
+        <w:t>: отчёт о расходе, ведомость остатков.</w:t>
+      </w:r>
+    </w:p>
+    <w:p>
+      <w:pPr>
+        <w:shd w:val="clear" w:color="auto" w:fill="FFFFFF"/>
+        <w:spacing w:after="0" w:line="360" w:lineRule="auto"/>
+        <w:ind w:firstLine="709"/>
+        <w:contextualSpacing/>
+        <w:jc w:val="both"/>
+        <w:rPr>
+          <w:rFonts w:ascii="Times New Roman" w:eastAsia="Times New Roman" w:hAnsi="Times New Roman" w:cs="Times New Roman"/>
+          <w:color w:val="222222"/>
+          <w:sz w:val="28"/>
+          <w:szCs w:val="28"/>
+          <w:lang w:eastAsia="ru-RU"/>
+        </w:rPr>
+      </w:pPr>
+      <w:r>
+        <w:rPr>
+          <w:rFonts w:ascii="Times New Roman" w:eastAsia="Times New Roman" w:hAnsi="Times New Roman" w:cs="Times New Roman"/>
+          <w:b/>
+          <w:color w:val="222222"/>
+          <w:sz w:val="28"/>
+          <w:szCs w:val="28"/>
+          <w:lang w:eastAsia="ru-RU"/>
+        </w:rPr>
+        <w:t xml:space="preserve">1.4. </w:t>
+      </w:r>
+      <w:r>
+        <w:rPr>
+          <w:rFonts w:ascii="Times New Roman" w:eastAsia="Times New Roman" w:hAnsi="Times New Roman" w:cs="Times New Roman"/>
+          <w:b/>
+          <w:color w:val="222222"/>
+          <w:sz w:val="28"/>
+          <w:szCs w:val="28"/>
+          <w:lang w:eastAsia="ru-RU"/>
+        </w:rPr>
+        <w:t>Ограничения</w:t>
+      </w:r>
+      <w:r>
+        <w:rPr>
+          <w:rFonts w:ascii="Times New Roman" w:eastAsia="Times New Roman" w:hAnsi="Times New Roman" w:cs="Times New Roman"/>
+          <w:color w:val="222222"/>
+          <w:sz w:val="28"/>
+          <w:szCs w:val="28"/>
+          <w:lang w:eastAsia="ru-RU"/>
+        </w:rPr>
+        <w:t>. Интеграция с системами поставщиков не рассматривается; доступ — с компьютера или планшета.</w:t>
+      </w:r>
+    </w:p>
+    <w:p>
+      <w:pPr>
+        <w:shd w:val="clear" w:color="auto" w:fill="FFFFFF"/>
+        <w:spacing w:after="0" w:line="360" w:lineRule="auto"/>
+        <w:ind w:firstLine="709"/>
+        <w:contextualSpacing/>
+        <w:rPr>
+          <w:rFonts w:ascii="Times New Roman" w:eastAsia="Times New Roman" w:hAnsi="Times New Roman" w:cs="Times New Roman"/>
+          <w:b/>
+          <w:color w:val="222222"/>
+          <w:sz w:val="28"/>
+          <w:szCs w:val="28"/>
+          <w:lang w:eastAsia="ru-RU"/>
+        </w:rPr>
+      </w:pPr>
+      <w:r>
+        <w:rPr>
+          <w:rFonts w:ascii="Times New Roman" w:eastAsia="Times New Roman" w:hAnsi="Times New Roman" w:cs="Times New Roman"/>
+          <w:b/>
+          <w:color w:val="222222"/>
+          <w:sz w:val="28"/>
+          <w:szCs w:val="28"/>
+          <w:lang w:eastAsia="ru-RU"/>
+        </w:rPr>
+        <w:t>2. АНАЛИЗ ЗАДАЧ И ПРОЦЕССОВ</w:t>
+      </w:r>
+      <w:r>
+        <w:rPr>
+          <w:rFonts w:ascii="Times New Roman" w:eastAsia="Times New Roman" w:hAnsi="Times New Roman" w:cs="Times New Roman"/>
+          <w:b/>
+          <w:color w:val="222222"/>
+          <w:sz w:val="28"/>
+          <w:szCs w:val="28"/>
+          <w:lang w:eastAsia="ru-RU"/>
+        </w:rPr>
+        <w:t xml:space="preserve"> ПРЕДМЕТНОЙ ОБЛАСТИ</w:t>
+      </w:r>
+    </w:p>
+    <w:p>
+      <w:pPr>
+        <w:shd w:val="clear" w:color="auto" w:fill="FFFFFF"/>
+        <w:spacing w:after="0" w:line="360" w:lineRule="auto"/>
+        <w:ind w:firstLine="709"/>
+        <w:contextualSpacing/>
+        <w:jc w:val="both"/>
+        <w:rPr>
+          <w:rFonts w:ascii="Times New Roman" w:eastAsia="Times New Roman" w:hAnsi="Times New Roman" w:cs="Times New Roman"/>
+          <w:b/>
+          <w:color w:val="222222"/>
+          <w:sz w:val="28"/>
+          <w:szCs w:val="28"/>
+          <w:lang w:eastAsia="ru-RU"/>
+        </w:rPr>
+      </w:pPr>
+      <w:r>
+        <w:rPr>
+          <w:rFonts w:ascii="Times New Roman" w:eastAsia="Times New Roman" w:hAnsi="Times New Roman" w:cs="Times New Roman"/>
+          <w:b/>
+          <w:color w:val="222222"/>
+          <w:sz w:val="28"/>
+          <w:szCs w:val="28"/>
+          <w:lang w:eastAsia="ru-RU"/>
+        </w:rPr>
+        <w:t>2.1. Процесс AS-IS:</w:t>
+      </w:r>
+    </w:p>
+    <w:p>
+      <w:pPr>
+        <w:shd w:val="clear" w:color="auto" w:fill="FFFFFF"/>
+        <w:spacing w:after="0" w:line="360" w:lineRule="auto"/>
+        <w:ind w:left="708" w:firstLine="709"/>
+        <w:contextualSpacing/>
+        <w:jc w:val="both"/>
+        <w:rPr>
+          <w:rFonts w:ascii="Times New Roman" w:eastAsia="Times New Roman" w:hAnsi="Times New Roman" w:cs="Times New Roman"/>
+          <w:color w:val="222222"/>
+          <w:sz w:val="28"/>
+          <w:szCs w:val="28"/>
+          <w:lang w:eastAsia="ru-RU"/>
+        </w:rPr>
+      </w:pPr>
+      <w:r>
+        <w:rPr>
+          <w:rFonts w:ascii="Times New Roman" w:eastAsia="Times New Roman" w:hAnsi="Times New Roman" w:cs="Times New Roman"/>
+          <w:color w:val="222222"/>
+          <w:sz w:val="28"/>
+          <w:szCs w:val="28"/>
+          <w:lang w:eastAsia="ru-RU"/>
+        </w:rPr>
+        <w:t xml:space="preserve">1. Заявка — устно или в </w:t>
+      </w:r>
+      <w:proofErr w:type="spellStart"/>
+      <w:r>
+        <w:rPr>
+          <w:rFonts w:ascii="Times New Roman" w:eastAsia="Times New Roman" w:hAnsi="Times New Roman" w:cs="Times New Roman"/>
+          <w:color w:val="222222"/>
+          <w:sz w:val="28"/>
+          <w:szCs w:val="28"/>
+          <w:lang w:eastAsia="ru-RU"/>
+        </w:rPr>
+        <w:t>мессенджере</w:t>
+      </w:r>
+      <w:proofErr w:type="spellEnd"/>
+      <w:r>
+        <w:rPr>
+          <w:rFonts w:ascii="Times New Roman" w:eastAsia="Times New Roman" w:hAnsi="Times New Roman" w:cs="Times New Roman"/>
+          <w:color w:val="222222"/>
+          <w:sz w:val="28"/>
+          <w:szCs w:val="28"/>
+          <w:lang w:eastAsia="ru-RU"/>
+        </w:rPr>
+        <w:t>.</w:t>
+      </w:r>
+    </w:p>
+    <w:p>
+      <w:pPr>
+        <w:shd w:val="clear" w:color="auto" w:fill="FFFFFF"/>
+        <w:spacing w:after="0" w:line="360" w:lineRule="auto"/>
+        <w:ind w:left="708" w:firstLine="709"/>
+        <w:contextualSpacing/>
+        <w:jc w:val="both"/>
+        <w:rPr>
+          <w:rFonts w:ascii="Times New Roman" w:eastAsia="Times New Roman" w:hAnsi="Times New Roman" w:cs="Times New Roman"/>
+          <w:color w:val="222222"/>
+          <w:sz w:val="28"/>
+          <w:szCs w:val="28"/>
+          <w:lang w:eastAsia="ru-RU"/>
+        </w:rPr>
+      </w:pPr>
+      <w:r>
+        <w:rPr>
+          <w:rFonts w:ascii="Times New Roman" w:eastAsia="Times New Roman" w:hAnsi="Times New Roman" w:cs="Times New Roman"/>
+          <w:color w:val="222222"/>
+          <w:sz w:val="28"/>
+          <w:szCs w:val="28"/>
+          <w:lang w:eastAsia="ru-RU"/>
+        </w:rPr>
+        <w:t>2. Закупка и накладные — на бумаге, с задержками.</w:t>
+      </w:r>
+    </w:p>
+    <w:p>
+      <w:pPr>
+        <w:shd w:val="clear" w:color="auto" w:fill="FFFFFF"/>
+        <w:spacing w:after="0" w:line="360" w:lineRule="auto"/>
+        <w:ind w:left="708" w:firstLine="709"/>
+        <w:contextualSpacing/>
+        <w:jc w:val="both"/>
+        <w:rPr>
+          <w:rFonts w:ascii="Times New Roman" w:eastAsia="Times New Roman" w:hAnsi="Times New Roman" w:cs="Times New Roman"/>
+          <w:color w:val="222222"/>
+          <w:sz w:val="28"/>
+          <w:szCs w:val="28"/>
+          <w:lang w:eastAsia="ru-RU"/>
+        </w:rPr>
+      </w:pPr>
+      <w:r>
+        <w:rPr>
+          <w:rFonts w:ascii="Times New Roman" w:eastAsia="Times New Roman" w:hAnsi="Times New Roman" w:cs="Times New Roman"/>
+          <w:color w:val="222222"/>
+          <w:sz w:val="28"/>
+          <w:szCs w:val="28"/>
+          <w:lang w:eastAsia="ru-RU"/>
+        </w:rPr>
+        <w:t>3. Передача на объект фиксируется не всегда.</w:t>
+      </w:r>
+    </w:p>
+    <w:p>
+      <w:pPr>
+        <w:shd w:val="clear" w:color="auto" w:fill="FFFFFF"/>
+        <w:spacing w:after="0" w:line="360" w:lineRule="auto"/>
+        <w:ind w:left="708" w:firstLine="709"/>
+        <w:contextualSpacing/>
+        <w:jc w:val="both"/>
+        <w:rPr>
+          <w:rFonts w:ascii="Times New Roman" w:eastAsia="Times New Roman" w:hAnsi="Times New Roman" w:cs="Times New Roman"/>
+          <w:color w:val="222222"/>
+          <w:sz w:val="28"/>
+          <w:szCs w:val="28"/>
+          <w:lang w:eastAsia="ru-RU"/>
+        </w:rPr>
+      </w:pPr>
+      <w:r>
+        <w:rPr>
+          <w:rFonts w:ascii="Times New Roman" w:eastAsia="Times New Roman" w:hAnsi="Times New Roman" w:cs="Times New Roman"/>
+          <w:color w:val="222222"/>
+          <w:sz w:val="28"/>
+          <w:szCs w:val="28"/>
+          <w:lang w:eastAsia="ru-RU"/>
+        </w:rPr>
+        <w:t>4. Списание — постфактум.</w:t>
+      </w:r>
+    </w:p>
+    <w:p>
+      <w:pPr>
+        <w:shd w:val="clear" w:color="auto" w:fill="FFFFFF"/>
+        <w:spacing w:after="0" w:line="360" w:lineRule="auto"/>
+        <w:ind w:left="708" w:firstLine="709"/>
+        <w:contextualSpacing/>
+        <w:jc w:val="both"/>
+        <w:rPr>
+          <w:rFonts w:ascii="Times New Roman" w:eastAsia="Times New Roman" w:hAnsi="Times New Roman" w:cs="Times New Roman"/>
+          <w:color w:val="222222"/>
+          <w:sz w:val="28"/>
+          <w:szCs w:val="28"/>
+          <w:lang w:eastAsia="ru-RU"/>
+        </w:rPr>
+      </w:pPr>
+      <w:r>
+        <w:rPr>
+          <w:rFonts w:ascii="Times New Roman" w:eastAsia="Times New Roman" w:hAnsi="Times New Roman" w:cs="Times New Roman"/>
+          <w:color w:val="222222"/>
+          <w:sz w:val="28"/>
+          <w:szCs w:val="28"/>
+          <w:lang w:eastAsia="ru-RU"/>
+        </w:rPr>
+        <w:t xml:space="preserve">5. Отчётность — вручную в </w:t>
+      </w:r>
+      <w:proofErr w:type="spellStart"/>
+      <w:r>
+        <w:rPr>
+          <w:rFonts w:ascii="Times New Roman" w:eastAsia="Times New Roman" w:hAnsi="Times New Roman" w:cs="Times New Roman"/>
+          <w:color w:val="222222"/>
+          <w:sz w:val="28"/>
+          <w:szCs w:val="28"/>
+          <w:lang w:eastAsia="ru-RU"/>
+        </w:rPr>
+        <w:t>Excel</w:t>
+      </w:r>
+      <w:proofErr w:type="spellEnd"/>
+      <w:r>
+        <w:rPr>
+          <w:rFonts w:ascii="Times New Roman" w:eastAsia="Times New Roman" w:hAnsi="Times New Roman" w:cs="Times New Roman"/>
+          <w:color w:val="222222"/>
+          <w:sz w:val="28"/>
+          <w:szCs w:val="28"/>
+          <w:lang w:eastAsia="ru-RU"/>
+        </w:rPr>
+        <w:t xml:space="preserve"> раз в месяц.</w:t>
+      </w:r>
+    </w:p>
+    <w:p>
+      <w:pPr>
+        <w:shd w:val="clear" w:color="auto" w:fill="FFFFFF"/>
+        <w:spacing w:after="0" w:line="360" w:lineRule="auto"/>
+        <w:ind w:firstLine="709"/>
+        <w:contextualSpacing/>
+        <w:jc w:val="both"/>
+        <w:rPr>
+          <w:rFonts w:ascii="Times New Roman" w:eastAsia="Times New Roman" w:hAnsi="Times New Roman" w:cs="Times New Roman"/>
+          <w:b/>
+          <w:color w:val="222222"/>
+          <w:sz w:val="28"/>
+          <w:szCs w:val="28"/>
+          <w:lang w:eastAsia="ru-RU"/>
+        </w:rPr>
+      </w:pPr>
+      <w:r>
+        <w:rPr>
+          <w:rFonts w:ascii="Times New Roman" w:eastAsia="Times New Roman" w:hAnsi="Times New Roman" w:cs="Times New Roman"/>
+          <w:b/>
+          <w:color w:val="222222"/>
+          <w:sz w:val="28"/>
+          <w:szCs w:val="28"/>
+          <w:lang w:eastAsia="ru-RU"/>
+        </w:rPr>
+        <w:t>2.2. Недостатки:</w:t>
+      </w:r>
+    </w:p>
+    <w:p>
+      <w:pPr>
+        <w:shd w:val="clear" w:color="auto" w:fill="FFFFFF"/>
+        <w:spacing w:after="0" w:line="360" w:lineRule="auto"/>
+        <w:ind w:left="708" w:firstLine="709"/>
+        <w:contextualSpacing/>
+        <w:jc w:val="both"/>
+        <w:rPr>
+          <w:rFonts w:ascii="Times New Roman" w:eastAsia="Times New Roman" w:hAnsi="Times New Roman" w:cs="Times New Roman"/>
+          <w:color w:val="222222"/>
+          <w:sz w:val="28"/>
+          <w:szCs w:val="28"/>
+          <w:lang w:eastAsia="ru-RU"/>
+        </w:rPr>
+      </w:pPr>
+      <w:r>
+        <w:rPr>
+          <w:rFonts w:ascii="Times New Roman" w:eastAsia="Times New Roman" w:hAnsi="Times New Roman" w:cs="Times New Roman"/>
+          <w:color w:val="222222"/>
+          <w:sz w:val="28"/>
+          <w:szCs w:val="28"/>
+          <w:lang w:eastAsia="ru-RU"/>
+        </w:rPr>
+        <w:t>Расхождение фактического наличия и учёта.</w:t>
+      </w:r>
+    </w:p>
+    <w:p>
+      <w:pPr>
+        <w:shd w:val="clear" w:color="auto" w:fill="FFFFFF"/>
+        <w:spacing w:after="0" w:line="360" w:lineRule="auto"/>
+        <w:ind w:left="708" w:firstLine="709"/>
+        <w:contextualSpacing/>
+        <w:jc w:val="both"/>
+        <w:rPr>
+          <w:rFonts w:ascii="Times New Roman" w:eastAsia="Times New Roman" w:hAnsi="Times New Roman" w:cs="Times New Roman"/>
+          <w:color w:val="222222"/>
+          <w:sz w:val="28"/>
+          <w:szCs w:val="28"/>
+          <w:lang w:eastAsia="ru-RU"/>
+        </w:rPr>
+      </w:pPr>
+      <w:r>
+        <w:rPr>
+          <w:rFonts w:ascii="Times New Roman" w:eastAsia="Times New Roman" w:hAnsi="Times New Roman" w:cs="Times New Roman"/>
+          <w:color w:val="222222"/>
+          <w:sz w:val="28"/>
+          <w:szCs w:val="28"/>
+          <w:lang w:eastAsia="ru-RU"/>
+        </w:rPr>
+        <w:t>Позднее выявление перерасхода.</w:t>
+      </w:r>
+    </w:p>
+    <w:p>
+      <w:pPr>
+        <w:shd w:val="clear" w:color="auto" w:fill="FFFFFF"/>
+        <w:spacing w:after="0" w:line="360" w:lineRule="auto"/>
+        <w:ind w:left="708" w:firstLine="709"/>
+        <w:contextualSpacing/>
+        <w:jc w:val="both"/>
+        <w:rPr>
+          <w:rFonts w:ascii="Times New Roman" w:eastAsia="Times New Roman" w:hAnsi="Times New Roman" w:cs="Times New Roman"/>
+          <w:color w:val="222222"/>
+          <w:sz w:val="28"/>
+          <w:szCs w:val="28"/>
+          <w:lang w:eastAsia="ru-RU"/>
+        </w:rPr>
+      </w:pPr>
+      <w:r>
+        <w:rPr>
+          <w:rFonts w:ascii="Times New Roman" w:eastAsia="Times New Roman" w:hAnsi="Times New Roman" w:cs="Times New Roman"/>
+          <w:color w:val="222222"/>
+          <w:sz w:val="28"/>
+          <w:szCs w:val="28"/>
+          <w:lang w:eastAsia="ru-RU"/>
+        </w:rPr>
+        <w:t>Потеря документов, двойной ввод.</w:t>
+      </w:r>
+    </w:p>
+    <w:p>
+      <w:pPr>
+        <w:shd w:val="clear" w:color="auto" w:fill="FFFFFF"/>
+        <w:spacing w:after="0" w:line="360" w:lineRule="auto"/>
+        <w:ind w:left="708" w:firstLine="709"/>
+        <w:contextualSpacing/>
+        <w:jc w:val="both"/>
+        <w:rPr>
+          <w:rFonts w:ascii="Times New Roman" w:eastAsia="Times New Roman" w:hAnsi="Times New Roman" w:cs="Times New Roman"/>
+          <w:color w:val="222222"/>
+          <w:sz w:val="28"/>
+          <w:szCs w:val="28"/>
+          <w:lang w:eastAsia="ru-RU"/>
+        </w:rPr>
+      </w:pPr>
+      <w:r>
+        <w:rPr>
+          <w:rFonts w:ascii="Times New Roman" w:eastAsia="Times New Roman" w:hAnsi="Times New Roman" w:cs="Times New Roman"/>
+          <w:color w:val="222222"/>
+          <w:sz w:val="28"/>
+          <w:szCs w:val="28"/>
+          <w:lang w:eastAsia="ru-RU"/>
+        </w:rPr>
+        <w:t>Нет онлайн-остатков по объектам.</w:t>
+      </w:r>
+    </w:p>
+    <w:p>
+      <w:pPr>
+        <w:shd w:val="clear" w:color="auto" w:fill="FFFFFF"/>
+        <w:spacing w:after="0" w:line="360" w:lineRule="auto"/>
+        <w:ind w:firstLine="709"/>
+        <w:contextualSpacing/>
+        <w:jc w:val="both"/>
+        <w:rPr>
+          <w:rFonts w:ascii="Times New Roman" w:eastAsia="Times New Roman" w:hAnsi="Times New Roman" w:cs="Times New Roman"/>
+          <w:b/>
+          <w:color w:val="222222"/>
+          <w:sz w:val="28"/>
+          <w:szCs w:val="28"/>
+          <w:lang w:eastAsia="ru-RU"/>
+        </w:rPr>
+      </w:pPr>
+      <w:r>
+        <w:rPr>
+          <w:rFonts w:ascii="Times New Roman" w:eastAsia="Times New Roman" w:hAnsi="Times New Roman" w:cs="Times New Roman"/>
+          <w:b/>
+          <w:color w:val="222222"/>
+          <w:sz w:val="28"/>
+          <w:szCs w:val="28"/>
+          <w:lang w:eastAsia="ru-RU"/>
+        </w:rPr>
+        <w:t>2.3. Процесс TO-BE:</w:t>
+      </w:r>
+    </w:p>
+    <w:p>
+      <w:pPr>
+        <w:shd w:val="clear" w:color="auto" w:fill="FFFFFF"/>
+        <w:spacing w:after="0" w:line="360" w:lineRule="auto"/>
+        <w:ind w:left="708" w:firstLine="709"/>
+        <w:contextualSpacing/>
+        <w:jc w:val="both"/>
+        <w:rPr>
+          <w:rFonts w:ascii="Times New Roman" w:eastAsia="Times New Roman" w:hAnsi="Times New Roman" w:cs="Times New Roman"/>
+          <w:color w:val="222222"/>
+          <w:sz w:val="28"/>
+          <w:szCs w:val="28"/>
+          <w:lang w:eastAsia="ru-RU"/>
+        </w:rPr>
+      </w:pPr>
+      <w:r>
+        <w:rPr>
+          <w:rFonts w:ascii="Times New Roman" w:eastAsia="Times New Roman" w:hAnsi="Times New Roman" w:cs="Times New Roman"/>
+          <w:color w:val="222222"/>
+          <w:sz w:val="28"/>
+          <w:szCs w:val="28"/>
+          <w:lang w:eastAsia="ru-RU"/>
+        </w:rPr>
+        <w:t>1. Заявки в системе с согласованием.</w:t>
+      </w:r>
+    </w:p>
+    <w:p>
+      <w:pPr>
+        <w:shd w:val="clear" w:color="auto" w:fill="FFFFFF"/>
+        <w:spacing w:after="0" w:line="360" w:lineRule="auto"/>
+        <w:ind w:left="708" w:firstLine="709"/>
+        <w:contextualSpacing/>
+        <w:jc w:val="both"/>
+        <w:rPr>
+          <w:rFonts w:ascii="Times New Roman" w:eastAsia="Times New Roman" w:hAnsi="Times New Roman" w:cs="Times New Roman"/>
+          <w:color w:val="222222"/>
+          <w:sz w:val="28"/>
+          <w:szCs w:val="28"/>
+          <w:lang w:eastAsia="ru-RU"/>
+        </w:rPr>
+      </w:pPr>
+      <w:r>
+        <w:rPr>
+          <w:rFonts w:ascii="Times New Roman" w:eastAsia="Times New Roman" w:hAnsi="Times New Roman" w:cs="Times New Roman"/>
+          <w:color w:val="222222"/>
+          <w:sz w:val="28"/>
+          <w:szCs w:val="28"/>
+          <w:lang w:eastAsia="ru-RU"/>
+        </w:rPr>
+        <w:t>2. Приёмка по электронным накладным с привязкой к объекту.</w:t>
+      </w:r>
+    </w:p>
+    <w:p>
+      <w:pPr>
+        <w:shd w:val="clear" w:color="auto" w:fill="FFFFFF"/>
+        <w:spacing w:after="0" w:line="360" w:lineRule="auto"/>
+        <w:ind w:left="708" w:firstLine="709"/>
+        <w:contextualSpacing/>
+        <w:jc w:val="both"/>
+        <w:rPr>
+          <w:rFonts w:ascii="Times New Roman" w:eastAsia="Times New Roman" w:hAnsi="Times New Roman" w:cs="Times New Roman"/>
+          <w:color w:val="222222"/>
+          <w:sz w:val="28"/>
+          <w:szCs w:val="28"/>
+          <w:lang w:eastAsia="ru-RU"/>
+        </w:rPr>
+      </w:pPr>
+      <w:r>
+        <w:rPr>
+          <w:rFonts w:ascii="Times New Roman" w:eastAsia="Times New Roman" w:hAnsi="Times New Roman" w:cs="Times New Roman"/>
+          <w:color w:val="222222"/>
+          <w:sz w:val="28"/>
+          <w:szCs w:val="28"/>
+          <w:lang w:eastAsia="ru-RU"/>
+        </w:rPr>
+        <w:t>3. Ежедневная фиксация расхода прорабом.</w:t>
+      </w:r>
+    </w:p>
+    <w:p>
+      <w:pPr>
+        <w:shd w:val="clear" w:color="auto" w:fill="FFFFFF"/>
+        <w:spacing w:after="0" w:line="360" w:lineRule="auto"/>
+        <w:ind w:left="708" w:firstLine="709"/>
+        <w:contextualSpacing/>
+        <w:jc w:val="both"/>
+        <w:rPr>
+          <w:rFonts w:ascii="Times New Roman" w:eastAsia="Times New Roman" w:hAnsi="Times New Roman" w:cs="Times New Roman"/>
+          <w:color w:val="222222"/>
+          <w:sz w:val="28"/>
+          <w:szCs w:val="28"/>
+          <w:lang w:eastAsia="ru-RU"/>
+        </w:rPr>
+      </w:pPr>
+      <w:r>
+        <w:rPr>
+          <w:rFonts w:ascii="Times New Roman" w:eastAsia="Times New Roman" w:hAnsi="Times New Roman" w:cs="Times New Roman"/>
+          <w:color w:val="222222"/>
+          <w:sz w:val="28"/>
+          <w:szCs w:val="28"/>
+          <w:lang w:eastAsia="ru-RU"/>
+        </w:rPr>
+        <w:t>4. Автоматическое формирование актов списания (М-29).</w:t>
+      </w:r>
+    </w:p>
+    <w:p>
+      <w:pPr>
+        <w:shd w:val="clear" w:color="auto" w:fill="FFFFFF"/>
+        <w:spacing w:after="0" w:line="360" w:lineRule="auto"/>
+        <w:ind w:left="708" w:firstLine="709"/>
+        <w:contextualSpacing/>
+        <w:jc w:val="both"/>
+        <w:rPr>
+          <w:rFonts w:ascii="Times New Roman" w:eastAsia="Times New Roman" w:hAnsi="Times New Roman" w:cs="Times New Roman"/>
+          <w:color w:val="222222"/>
+          <w:sz w:val="28"/>
+          <w:szCs w:val="28"/>
+          <w:lang w:eastAsia="ru-RU"/>
+        </w:rPr>
+      </w:pPr>
+      <w:r>
+        <w:rPr>
+          <w:rFonts w:ascii="Times New Roman" w:eastAsia="Times New Roman" w:hAnsi="Times New Roman" w:cs="Times New Roman"/>
+          <w:color w:val="222222"/>
+          <w:sz w:val="28"/>
+          <w:szCs w:val="28"/>
+          <w:lang w:eastAsia="ru-RU"/>
+        </w:rPr>
+        <w:t>5. Онлайн-остатки и автоматическая отчётность.</w:t>
+      </w:r>
+    </w:p>
+    <w:p>
+      <w:pPr>
+        <w:shd w:val="clear" w:color="auto" w:fill="FFFFFF"/>
+        <w:spacing w:after="0" w:line="360" w:lineRule="auto"/>
+        <w:ind w:firstLine="709"/>
+        <w:contextualSpacing/>
+        <w:jc w:val="both"/>
+        <w:rPr>
+          <w:rFonts w:ascii="Times New Roman" w:eastAsia="Times New Roman" w:hAnsi="Times New Roman" w:cs="Times New Roman"/>
+          <w:b/>
+          <w:color w:val="222222"/>
+          <w:sz w:val="28"/>
+          <w:szCs w:val="28"/>
+          <w:lang w:eastAsia="ru-RU"/>
+        </w:rPr>
+      </w:pPr>
+      <w:r>
+        <w:rPr>
+          <w:rFonts w:ascii="Times New Roman" w:eastAsia="Times New Roman" w:hAnsi="Times New Roman" w:cs="Times New Roman"/>
+          <w:b/>
+          <w:color w:val="222222"/>
+          <w:sz w:val="28"/>
+          <w:szCs w:val="28"/>
+          <w:lang w:eastAsia="ru-RU"/>
+        </w:rPr>
+        <w:t>2.4. Задачи системы:</w:t>
+      </w:r>
+    </w:p>
+    <w:p>
+      <w:pPr>
+        <w:shd w:val="clear" w:color="auto" w:fill="FFFFFF"/>
+        <w:spacing w:after="0" w:line="360" w:lineRule="auto"/>
+        <w:ind w:left="708" w:firstLine="709"/>
+        <w:contextualSpacing/>
+        <w:rPr>
+          <w:rFonts w:ascii="Times New Roman" w:eastAsia="Times New Roman" w:hAnsi="Times New Roman" w:cs="Times New Roman"/>
+          <w:color w:val="222222"/>
+          <w:sz w:val="28"/>
+          <w:szCs w:val="28"/>
+          <w:lang w:eastAsia="ru-RU"/>
+        </w:rPr>
+      </w:pPr>
+      <w:r>
+        <w:rPr>
+          <w:rFonts w:ascii="Times New Roman" w:eastAsia="Times New Roman" w:hAnsi="Times New Roman" w:cs="Times New Roman"/>
+          <w:color w:val="222222"/>
+          <w:sz w:val="28"/>
+          <w:szCs w:val="28"/>
+          <w:lang w:eastAsia="ru-RU"/>
+        </w:rPr>
+        <w:t>1. Справочники (материалы, склады, объекты, сотрудники).</w:t>
+      </w:r>
+    </w:p>
+    <w:p>
+      <w:pPr>
+        <w:shd w:val="clear" w:color="auto" w:fill="FFFFFF"/>
+        <w:spacing w:after="0" w:line="360" w:lineRule="auto"/>
+        <w:ind w:left="708" w:firstLine="709"/>
+        <w:contextualSpacing/>
+        <w:rPr>
+          <w:rFonts w:ascii="Times New Roman" w:eastAsia="Times New Roman" w:hAnsi="Times New Roman" w:cs="Times New Roman"/>
+          <w:color w:val="222222"/>
+          <w:sz w:val="28"/>
+          <w:szCs w:val="28"/>
+          <w:lang w:eastAsia="ru-RU"/>
+        </w:rPr>
+      </w:pPr>
+      <w:r>
+        <w:rPr>
+          <w:rFonts w:ascii="Times New Roman" w:eastAsia="Times New Roman" w:hAnsi="Times New Roman" w:cs="Times New Roman"/>
+          <w:color w:val="222222"/>
+          <w:sz w:val="28"/>
+          <w:szCs w:val="28"/>
+          <w:lang w:eastAsia="ru-RU"/>
+        </w:rPr>
+        <w:t>2. Заявки и согласование.</w:t>
+      </w:r>
+    </w:p>
+    <w:p>
+      <w:pPr>
+        <w:shd w:val="clear" w:color="auto" w:fill="FFFFFF"/>
+        <w:spacing w:after="0" w:line="360" w:lineRule="auto"/>
+        <w:ind w:left="708" w:firstLine="709"/>
+        <w:contextualSpacing/>
+        <w:rPr>
+          <w:rFonts w:ascii="Times New Roman" w:eastAsia="Times New Roman" w:hAnsi="Times New Roman" w:cs="Times New Roman"/>
+          <w:color w:val="222222"/>
+          <w:sz w:val="28"/>
+          <w:szCs w:val="28"/>
+          <w:lang w:eastAsia="ru-RU"/>
+        </w:rPr>
+      </w:pPr>
+      <w:r>
+        <w:rPr>
+          <w:rFonts w:ascii="Times New Roman" w:eastAsia="Times New Roman" w:hAnsi="Times New Roman" w:cs="Times New Roman"/>
+          <w:color w:val="222222"/>
+          <w:sz w:val="28"/>
+          <w:szCs w:val="28"/>
+          <w:lang w:eastAsia="ru-RU"/>
+        </w:rPr>
+        <w:t>3. Учёт прихода, расхода, перемещения.</w:t>
+      </w:r>
+    </w:p>
+    <w:p>
+      <w:pPr>
+        <w:shd w:val="clear" w:color="auto" w:fill="FFFFFF"/>
+        <w:spacing w:after="0" w:line="360" w:lineRule="auto"/>
+        <w:ind w:left="708" w:firstLine="709"/>
+        <w:contextualSpacing/>
+        <w:rPr>
+          <w:rFonts w:ascii="Times New Roman" w:eastAsia="Times New Roman" w:hAnsi="Times New Roman" w:cs="Times New Roman"/>
+          <w:color w:val="222222"/>
+          <w:sz w:val="28"/>
+          <w:szCs w:val="28"/>
+          <w:lang w:eastAsia="ru-RU"/>
+        </w:rPr>
+      </w:pPr>
+      <w:r>
+        <w:rPr>
+          <w:rFonts w:ascii="Times New Roman" w:eastAsia="Times New Roman" w:hAnsi="Times New Roman" w:cs="Times New Roman"/>
+          <w:color w:val="222222"/>
+          <w:sz w:val="28"/>
+          <w:szCs w:val="28"/>
+          <w:lang w:eastAsia="ru-RU"/>
+        </w:rPr>
+        <w:t>4. Отчётность (остатки, расход по объекту, сравнение с нормами).</w:t>
+      </w:r>
+    </w:p>
+    <w:p>
+      <w:pPr>
+        <w:shd w:val="clear" w:color="auto" w:fill="FFFFFF"/>
+        <w:spacing w:after="0" w:line="360" w:lineRule="auto"/>
+        <w:ind w:left="708" w:firstLine="709"/>
+        <w:contextualSpacing/>
+        <w:rPr>
+          <w:rFonts w:ascii="Times New Roman" w:eastAsia="Times New Roman" w:hAnsi="Times New Roman" w:cs="Times New Roman"/>
+          <w:color w:val="222222"/>
+          <w:sz w:val="28"/>
+          <w:szCs w:val="28"/>
+          <w:lang w:eastAsia="ru-RU"/>
+        </w:rPr>
+      </w:pPr>
+      <w:r>
+        <w:rPr>
+          <w:rFonts w:ascii="Times New Roman" w:eastAsia="Times New Roman" w:hAnsi="Times New Roman" w:cs="Times New Roman"/>
+          <w:color w:val="222222"/>
+          <w:sz w:val="28"/>
+          <w:szCs w:val="28"/>
+          <w:lang w:eastAsia="ru-RU"/>
+        </w:rPr>
         <w:lastRenderedPageBreak/>
-        <w:t>Внутренние:</w:t>
-      </w:r>
-      <w:r>
-        <w:rPr>
-          <w:rFonts w:ascii="Times New Roman" w:eastAsia="Times New Roman" w:hAnsi="Times New Roman" w:cs="Times New Roman"/>
-          <w:color w:val="222222"/>
-          <w:sz w:val="28"/>
-          <w:szCs w:val="28"/>
-          <w:lang w:eastAsia="ru-RU"/>
-        </w:rPr>
-        <w:t xml:space="preserve"> требование-накладная (М-11), акт списания, материальный отчёт, АПО.</w:t>
-      </w:r>
-    </w:p>
-    <w:p>
-      <w:pPr>
-        <w:shd w:val="clear" w:color="auto" w:fill="FFFFFF"/>
-        <w:spacing w:after="0" w:line="360" w:lineRule="auto"/>
-        <w:ind w:left="707" w:firstLine="709"/>
-        <w:contextualSpacing/>
-        <w:jc w:val="both"/>
-        <w:rPr>
-          <w:rFonts w:ascii="Times New Roman" w:eastAsia="Times New Roman" w:hAnsi="Times New Roman" w:cs="Times New Roman"/>
-          <w:color w:val="222222"/>
-          <w:sz w:val="28"/>
-          <w:szCs w:val="28"/>
-          <w:lang w:eastAsia="ru-RU"/>
-        </w:rPr>
-      </w:pPr>
-      <w:r>
-        <w:rPr>
-          <w:rFonts w:ascii="Times New Roman" w:eastAsia="Times New Roman" w:hAnsi="Times New Roman" w:cs="Times New Roman"/>
-          <w:b/>
-          <w:color w:val="222222"/>
-          <w:sz w:val="28"/>
-          <w:szCs w:val="28"/>
-          <w:lang w:eastAsia="ru-RU"/>
-        </w:rPr>
-        <w:t>Выходные</w:t>
-      </w:r>
-      <w:r>
-        <w:rPr>
-          <w:rFonts w:ascii="Times New Roman" w:eastAsia="Times New Roman" w:hAnsi="Times New Roman" w:cs="Times New Roman"/>
-          <w:color w:val="222222"/>
-          <w:sz w:val="28"/>
-          <w:szCs w:val="28"/>
-          <w:lang w:eastAsia="ru-RU"/>
-        </w:rPr>
-        <w:t>: отчёт о расходе, ведомость остатков.</w:t>
+        <w:t>5. Права доступа (прораб — только свой объект).</w:t>
+      </w:r>
+    </w:p>
+    <w:p>
+      <w:pPr>
+        <w:shd w:val="clear" w:color="auto" w:fill="FFFFFF"/>
+        <w:spacing w:after="0" w:line="360" w:lineRule="auto"/>
+        <w:ind w:left="708" w:firstLine="709"/>
+        <w:contextualSpacing/>
+        <w:rPr>
+          <w:rFonts w:ascii="Times New Roman" w:eastAsia="Times New Roman" w:hAnsi="Times New Roman" w:cs="Times New Roman"/>
+          <w:color w:val="222222"/>
+          <w:sz w:val="28"/>
+          <w:szCs w:val="28"/>
+          <w:lang w:eastAsia="ru-RU"/>
+        </w:rPr>
+      </w:pPr>
+      <w:r>
+        <w:rPr>
+          <w:rFonts w:ascii="Times New Roman" w:eastAsia="Times New Roman" w:hAnsi="Times New Roman" w:cs="Times New Roman"/>
+          <w:color w:val="222222"/>
+          <w:sz w:val="28"/>
+          <w:szCs w:val="28"/>
+          <w:lang w:eastAsia="ru-RU"/>
+        </w:rPr>
+        <w:t>6. Экспорт для бухучёта.</w:t>
       </w:r>
     </w:p>
     <w:p>
@@ -839,28 +1652,37 @@
           <w:szCs w:val="28"/>
           <w:lang w:eastAsia="ru-RU"/>
         </w:rPr>
-        <w:t xml:space="preserve">1.4. </w:t>
-      </w:r>
-      <w:r>
-        <w:rPr>
-          <w:rFonts w:ascii="Times New Roman" w:eastAsia="Times New Roman" w:hAnsi="Times New Roman" w:cs="Times New Roman"/>
-          <w:b/>
-          <w:color w:val="222222"/>
-          <w:sz w:val="28"/>
-          <w:szCs w:val="28"/>
-          <w:lang w:eastAsia="ru-RU"/>
-        </w:rPr>
-        <w:t>Ограничения</w:t>
-      </w:r>
-      <w:r>
-        <w:rPr>
-          <w:rFonts w:ascii="Times New Roman" w:eastAsia="Times New Roman" w:hAnsi="Times New Roman" w:cs="Times New Roman"/>
-          <w:color w:val="222222"/>
-          <w:sz w:val="28"/>
-          <w:szCs w:val="28"/>
-          <w:lang w:eastAsia="ru-RU"/>
-        </w:rPr>
-        <w:t>. Интеграция с системами поставщиков не рассматривается; доступ — с компьютера или планшета.</w:t>
+        <w:t>2.5. Ожидаемый результат</w:t>
+      </w:r>
+      <w:r>
+        <w:rPr>
+          <w:rFonts w:ascii="Times New Roman" w:eastAsia="Times New Roman" w:hAnsi="Times New Roman" w:cs="Times New Roman"/>
+          <w:color w:val="222222"/>
+          <w:sz w:val="28"/>
+          <w:szCs w:val="28"/>
+          <w:lang w:eastAsia="ru-RU"/>
+        </w:rPr>
+        <w:t>: снижение перерасхода, ускорение документооборота, прозрачность движения материалов</w:t>
+      </w:r>
+      <w:r>
+        <w:rPr>
+          <w:rFonts w:ascii="Times New Roman" w:eastAsia="Times New Roman" w:hAnsi="Times New Roman" w:cs="Times New Roman"/>
+          <w:color w:val="222222"/>
+          <w:sz w:val="28"/>
+          <w:szCs w:val="28"/>
+          <w:lang w:eastAsia="ru-RU"/>
+        </w:rPr>
+        <w:t xml:space="preserve"> от заявки до списания</w:t>
+      </w:r>
+      <w:r>
+        <w:rPr>
+          <w:rFonts w:ascii="Times New Roman" w:eastAsia="Times New Roman" w:hAnsi="Times New Roman" w:cs="Times New Roman"/>
+          <w:color w:val="222222"/>
+          <w:sz w:val="28"/>
+          <w:szCs w:val="28"/>
+          <w:lang w:eastAsia="ru-RU"/>
+        </w:rPr>
+        <w:t>.</w:t>
       </w:r>
     </w:p>
     <w:p>
@@ -869,36 +1691,26 @@
         <w:spacing w:after="0" w:line="360" w:lineRule="auto"/>
         <w:ind w:firstLine="709"/>
         <w:contextualSpacing/>
-        <w:rPr>
-          <w:rFonts w:ascii="Times New Roman" w:eastAsia="Times New Roman" w:hAnsi="Times New Roman" w:cs="Times New Roman"/>
-          <w:b/>
-          <w:color w:val="222222"/>
-          <w:sz w:val="28"/>
-          <w:szCs w:val="28"/>
-          <w:lang w:eastAsia="ru-RU"/>
-        </w:rPr>
-      </w:pPr>
-      <w:r>
-        <w:rPr>
-          <w:rFonts w:ascii="Times New Roman" w:eastAsia="Times New Roman" w:hAnsi="Times New Roman" w:cs="Times New Roman"/>
-          <w:b/>
-          <w:color w:val="222222"/>
-          <w:sz w:val="28"/>
-          <w:szCs w:val="28"/>
-          <w:lang w:eastAsia="ru-RU"/>
-        </w:rPr>
-        <w:t>2. АНАЛИЗ ЗАДАЧ И ПРОЦЕССОВ</w:t>
-      </w:r>
-      <w:r>
-        <w:rPr>
-          <w:rFonts w:ascii="Times New Roman" w:eastAsia="Times New Roman" w:hAnsi="Times New Roman" w:cs="Times New Roman"/>
-          <w:b/>
-          <w:color w:val="222222"/>
-          <w:sz w:val="28"/>
-          <w:szCs w:val="28"/>
-          <w:lang w:eastAsia="ru-RU"/>
-        </w:rPr>
-        <w:t xml:space="preserve"> ПРЕДМЕТНОЙ ОБЛАСТИ</w:t>
+        <w:jc w:val="center"/>
+        <w:rPr>
+          <w:rFonts w:ascii="Times New Roman" w:eastAsia="Times New Roman" w:hAnsi="Times New Roman" w:cs="Times New Roman"/>
+          <w:b/>
+          <w:color w:val="222222"/>
+          <w:sz w:val="28"/>
+          <w:szCs w:val="28"/>
+          <w:lang w:eastAsia="ru-RU"/>
+        </w:rPr>
+      </w:pPr>
+      <w:r>
+        <w:rPr>
+          <w:rFonts w:ascii="Times New Roman" w:eastAsia="Times New Roman" w:hAnsi="Times New Roman" w:cs="Times New Roman"/>
+          <w:b/>
+          <w:color w:val="222222"/>
+          <w:sz w:val="28"/>
+          <w:szCs w:val="28"/>
+          <w:lang w:eastAsia="ru-RU"/>
+        </w:rPr>
+        <w:t>3. ОРГАНИЗАЦИОННАЯ СТРУКТУРА ПРЕПРИЯТИЯ</w:t>
       </w:r>
     </w:p>
     <w:p>
@@ -907,52 +1719,80 @@
         <w:spacing w:after="0" w:line="360" w:lineRule="auto"/>
         <w:ind w:firstLine="709"/>
         <w:contextualSpacing/>
-        <w:jc w:val="both"/>
-        <w:rPr>
-          <w:rFonts w:ascii="Times New Roman" w:eastAsia="Times New Roman" w:hAnsi="Times New Roman" w:cs="Times New Roman"/>
-          <w:b/>
-          <w:color w:val="222222"/>
-          <w:sz w:val="28"/>
-          <w:szCs w:val="28"/>
-          <w:lang w:eastAsia="ru-RU"/>
-        </w:rPr>
-      </w:pPr>
-      <w:r>
-        <w:rPr>
-          <w:rFonts w:ascii="Times New Roman" w:eastAsia="Times New Roman" w:hAnsi="Times New Roman" w:cs="Times New Roman"/>
-          <w:b/>
-          <w:color w:val="222222"/>
-          <w:sz w:val="28"/>
-          <w:szCs w:val="28"/>
-          <w:lang w:eastAsia="ru-RU"/>
-        </w:rPr>
-        <w:t>2.1. Процесс AS-IS:</w:t>
-      </w:r>
-    </w:p>
-    <w:p>
-      <w:pPr>
-        <w:shd w:val="clear" w:color="auto" w:fill="FFFFFF"/>
-        <w:spacing w:after="0" w:line="360" w:lineRule="auto"/>
-        <w:ind w:left="708" w:firstLine="709"/>
-        <w:contextualSpacing/>
-        <w:jc w:val="both"/>
-        <w:rPr>
-          <w:rFonts w:ascii="Times New Roman" w:eastAsia="Times New Roman" w:hAnsi="Times New Roman" w:cs="Times New Roman"/>
-          <w:color w:val="222222"/>
-          <w:sz w:val="28"/>
-          <w:szCs w:val="28"/>
-          <w:lang w:eastAsia="ru-RU"/>
-        </w:rPr>
-      </w:pPr>
-      <w:r>
-        <w:rPr>
-          <w:rFonts w:ascii="Times New Roman" w:eastAsia="Times New Roman" w:hAnsi="Times New Roman" w:cs="Times New Roman"/>
-          <w:color w:val="222222"/>
-          <w:sz w:val="28"/>
-          <w:szCs w:val="28"/>
-          <w:lang w:eastAsia="ru-RU"/>
-        </w:rPr>
-        <w:t xml:space="preserve">1. Заявка — устно или в </w:t>
+        <w:rPr>
+          <w:rFonts w:ascii="Times New Roman" w:eastAsia="Times New Roman" w:hAnsi="Times New Roman" w:cs="Times New Roman"/>
+          <w:b/>
+          <w:color w:val="222222"/>
+          <w:sz w:val="28"/>
+          <w:szCs w:val="28"/>
+          <w:lang w:eastAsia="ru-RU"/>
+        </w:rPr>
+      </w:pPr>
+      <w:r>
+        <w:rPr>
+          <w:rFonts w:ascii="Times New Roman" w:eastAsia="Times New Roman" w:hAnsi="Times New Roman" w:cs="Times New Roman"/>
+          <w:b/>
+          <w:color w:val="222222"/>
+          <w:sz w:val="28"/>
+          <w:szCs w:val="28"/>
+          <w:lang w:eastAsia="ru-RU"/>
+        </w:rPr>
+        <w:t>3.1 Тип структуры.</w:t>
+      </w:r>
+    </w:p>
+    <w:p>
+      <w:pPr>
+        <w:shd w:val="clear" w:color="auto" w:fill="FFFFFF"/>
+        <w:spacing w:after="0" w:line="360" w:lineRule="auto"/>
+        <w:ind w:firstLine="709"/>
+        <w:contextualSpacing/>
+        <w:rPr>
+          <w:rFonts w:ascii="Times New Roman" w:eastAsia="Times New Roman" w:hAnsi="Times New Roman" w:cs="Times New Roman"/>
+          <w:color w:val="222222"/>
+          <w:sz w:val="28"/>
+          <w:szCs w:val="28"/>
+          <w:lang w:eastAsia="ru-RU"/>
+        </w:rPr>
+      </w:pPr>
+      <w:r>
+        <w:rPr>
+          <w:rFonts w:ascii="Times New Roman" w:eastAsia="Times New Roman" w:hAnsi="Times New Roman" w:cs="Times New Roman"/>
+          <w:color w:val="222222"/>
+          <w:sz w:val="28"/>
+          <w:szCs w:val="28"/>
+          <w:lang w:eastAsia="ru-RU"/>
+        </w:rPr>
+        <w:t>Организация имеет линейно-функциональную структуру:</w:t>
+      </w:r>
+      <w:r>
+        <w:rPr>
+          <w:rFonts w:ascii="Times New Roman" w:eastAsia="Times New Roman" w:hAnsi="Times New Roman" w:cs="Times New Roman"/>
+          <w:color w:val="222222"/>
+          <w:sz w:val="28"/>
+          <w:szCs w:val="28"/>
+          <w:lang w:eastAsia="ru-RU"/>
+        </w:rPr>
+        <w:t xml:space="preserve"> руководство осуществляет директор, ему напрямую подчиняются функциональные руководители</w:t>
+      </w:r>
+      <w:r>
+        <w:rPr>
+          <w:rFonts w:ascii="Times New Roman" w:eastAsia="Times New Roman" w:hAnsi="Times New Roman" w:cs="Times New Roman"/>
+          <w:color w:val="222222"/>
+          <w:sz w:val="28"/>
+          <w:szCs w:val="28"/>
+          <w:lang w:eastAsia="ru-RU"/>
+        </w:rPr>
+        <w:t xml:space="preserve"> (</w:t>
+      </w:r>
+      <w:r>
+        <w:rPr>
+          <w:rFonts w:ascii="Times New Roman" w:eastAsia="Times New Roman" w:hAnsi="Times New Roman" w:cs="Times New Roman"/>
+          <w:color w:val="222222"/>
+          <w:sz w:val="28"/>
+          <w:szCs w:val="28"/>
+          <w:lang w:eastAsia="ru-RU"/>
+        </w:rPr>
+        <w:t xml:space="preserve">прораб, </w:t>
       </w:r>
       <w:proofErr w:type="spellStart"/>
       <w:r>
@@ -963,7 +1803,7 @@
           <w:szCs w:val="28"/>
           <w:lang w:eastAsia="ru-RU"/>
         </w:rPr>
-        <w:t>мессенджере</w:t>
+        <w:t>снабжанец</w:t>
       </w:r>
       <w:proofErr w:type="spellEnd"/>
       <w:r>
@@ -974,790 +1814,6 @@
           <w:szCs w:val="28"/>
           <w:lang w:eastAsia="ru-RU"/>
         </w:rPr>
-        <w:t>.</w:t>
-      </w:r>
-    </w:p>
-    <w:p>
-      <w:pPr>
-        <w:shd w:val="clear" w:color="auto" w:fill="FFFFFF"/>
-        <w:spacing w:after="0" w:line="360" w:lineRule="auto"/>
-        <w:ind w:left="708" w:firstLine="709"/>
-        <w:contextualSpacing/>
-        <w:jc w:val="both"/>
-        <w:rPr>
-          <w:rFonts w:ascii="Times New Roman" w:eastAsia="Times New Roman" w:hAnsi="Times New Roman" w:cs="Times New Roman"/>
-          <w:color w:val="222222"/>
-          <w:sz w:val="28"/>
-          <w:szCs w:val="28"/>
-          <w:lang w:eastAsia="ru-RU"/>
-        </w:rPr>
-      </w:pPr>
-      <w:r>
-        <w:rPr>
-          <w:rFonts w:ascii="Times New Roman" w:eastAsia="Times New Roman" w:hAnsi="Times New Roman" w:cs="Times New Roman"/>
-          <w:color w:val="222222"/>
-          <w:sz w:val="28"/>
-          <w:szCs w:val="28"/>
-          <w:lang w:eastAsia="ru-RU"/>
-        </w:rPr>
-        <w:t>2. Закупка и накладные — на бумаге, с задержками.</w:t>
-      </w:r>
-    </w:p>
-    <w:p>
-      <w:pPr>
-        <w:shd w:val="clear" w:color="auto" w:fill="FFFFFF"/>
-        <w:spacing w:after="0" w:line="360" w:lineRule="auto"/>
-        <w:ind w:left="708" w:firstLine="709"/>
-        <w:contextualSpacing/>
-        <w:jc w:val="both"/>
-        <w:rPr>
-          <w:rFonts w:ascii="Times New Roman" w:eastAsia="Times New Roman" w:hAnsi="Times New Roman" w:cs="Times New Roman"/>
-          <w:color w:val="222222"/>
-          <w:sz w:val="28"/>
-          <w:szCs w:val="28"/>
-          <w:lang w:eastAsia="ru-RU"/>
-        </w:rPr>
-      </w:pPr>
-      <w:r>
-        <w:rPr>
-          <w:rFonts w:ascii="Times New Roman" w:eastAsia="Times New Roman" w:hAnsi="Times New Roman" w:cs="Times New Roman"/>
-          <w:color w:val="222222"/>
-          <w:sz w:val="28"/>
-          <w:szCs w:val="28"/>
-          <w:lang w:eastAsia="ru-RU"/>
-        </w:rPr>
-        <w:t>3. Передача на объект фиксируется не всегда.</w:t>
-      </w:r>
-    </w:p>
-    <w:p>
-      <w:pPr>
-        <w:shd w:val="clear" w:color="auto" w:fill="FFFFFF"/>
-        <w:spacing w:after="0" w:line="360" w:lineRule="auto"/>
-        <w:ind w:left="708" w:firstLine="709"/>
-        <w:contextualSpacing/>
-        <w:jc w:val="both"/>
-        <w:rPr>
-          <w:rFonts w:ascii="Times New Roman" w:eastAsia="Times New Roman" w:hAnsi="Times New Roman" w:cs="Times New Roman"/>
-          <w:color w:val="222222"/>
-          <w:sz w:val="28"/>
-          <w:szCs w:val="28"/>
-          <w:lang w:eastAsia="ru-RU"/>
-        </w:rPr>
-      </w:pPr>
-      <w:r>
-        <w:rPr>
-          <w:rFonts w:ascii="Times New Roman" w:eastAsia="Times New Roman" w:hAnsi="Times New Roman" w:cs="Times New Roman"/>
-          <w:color w:val="222222"/>
-          <w:sz w:val="28"/>
-          <w:szCs w:val="28"/>
-          <w:lang w:eastAsia="ru-RU"/>
-        </w:rPr>
-        <w:t>4. Списание — постфактум.</w:t>
-      </w:r>
-    </w:p>
-    <w:p>
-      <w:pPr>
-        <w:shd w:val="clear" w:color="auto" w:fill="FFFFFF"/>
-        <w:spacing w:after="0" w:line="360" w:lineRule="auto"/>
-        <w:ind w:left="708" w:firstLine="709"/>
-        <w:contextualSpacing/>
-        <w:jc w:val="both"/>
-        <w:rPr>
-          <w:rFonts w:ascii="Times New Roman" w:eastAsia="Times New Roman" w:hAnsi="Times New Roman" w:cs="Times New Roman"/>
-          <w:color w:val="222222"/>
-          <w:sz w:val="28"/>
-          <w:szCs w:val="28"/>
-          <w:lang w:eastAsia="ru-RU"/>
-        </w:rPr>
-      </w:pPr>
-      <w:r>
-        <w:rPr>
-          <w:rFonts w:ascii="Times New Roman" w:eastAsia="Times New Roman" w:hAnsi="Times New Roman" w:cs="Times New Roman"/>
-          <w:color w:val="222222"/>
-          <w:sz w:val="28"/>
-          <w:szCs w:val="28"/>
-          <w:lang w:eastAsia="ru-RU"/>
-        </w:rPr>
-        <w:t xml:space="preserve">5. Отчётность — вручную в </w:t>
-      </w:r>
-      <w:proofErr w:type="spellStart"/>
-      <w:r>
-        <w:rPr>
-          <w:rFonts w:ascii="Times New Roman" w:eastAsia="Times New Roman" w:hAnsi="Times New Roman" w:cs="Times New Roman"/>
-          <w:color w:val="222222"/>
-          <w:sz w:val="28"/>
-          <w:szCs w:val="28"/>
-          <w:lang w:eastAsia="ru-RU"/>
-        </w:rPr>
-        <w:t>Excel</w:t>
-      </w:r>
-      <w:proofErr w:type="spellEnd"/>
-      <w:r>
-        <w:rPr>
-          <w:rFonts w:ascii="Times New Roman" w:eastAsia="Times New Roman" w:hAnsi="Times New Roman" w:cs="Times New Roman"/>
-          <w:color w:val="222222"/>
-          <w:sz w:val="28"/>
-          <w:szCs w:val="28"/>
-          <w:lang w:eastAsia="ru-RU"/>
-        </w:rPr>
-        <w:t xml:space="preserve"> раз в месяц.</w:t>
-      </w:r>
-    </w:p>
-    <w:p>
-      <w:pPr>
-        <w:shd w:val="clear" w:color="auto" w:fill="FFFFFF"/>
-        <w:spacing w:after="0" w:line="360" w:lineRule="auto"/>
-        <w:ind w:firstLine="709"/>
-        <w:contextualSpacing/>
-        <w:jc w:val="both"/>
-        <w:rPr>
-          <w:rFonts w:ascii="Times New Roman" w:eastAsia="Times New Roman" w:hAnsi="Times New Roman" w:cs="Times New Roman"/>
-          <w:b/>
-          <w:color w:val="222222"/>
-          <w:sz w:val="28"/>
-          <w:szCs w:val="28"/>
-          <w:lang w:eastAsia="ru-RU"/>
-        </w:rPr>
-      </w:pPr>
-      <w:r>
-        <w:rPr>
-          <w:rFonts w:ascii="Times New Roman" w:eastAsia="Times New Roman" w:hAnsi="Times New Roman" w:cs="Times New Roman"/>
-          <w:b/>
-          <w:color w:val="222222"/>
-          <w:sz w:val="28"/>
-          <w:szCs w:val="28"/>
-          <w:lang w:eastAsia="ru-RU"/>
-        </w:rPr>
-        <w:t>2.2. Недостатки:</w:t>
-      </w:r>
-    </w:p>
-    <w:p>
-      <w:pPr>
-        <w:shd w:val="clear" w:color="auto" w:fill="FFFFFF"/>
-        <w:spacing w:after="0" w:line="360" w:lineRule="auto"/>
-        <w:ind w:left="708" w:firstLine="709"/>
-        <w:contextualSpacing/>
-        <w:jc w:val="both"/>
-        <w:rPr>
-          <w:rFonts w:ascii="Times New Roman" w:eastAsia="Times New Roman" w:hAnsi="Times New Roman" w:cs="Times New Roman"/>
-          <w:color w:val="222222"/>
-          <w:sz w:val="28"/>
-          <w:szCs w:val="28"/>
-          <w:lang w:eastAsia="ru-RU"/>
-        </w:rPr>
-      </w:pPr>
-      <w:r>
-        <w:rPr>
-          <w:rFonts w:ascii="Times New Roman" w:eastAsia="Times New Roman" w:hAnsi="Times New Roman" w:cs="Times New Roman"/>
-          <w:color w:val="222222"/>
-          <w:sz w:val="28"/>
-          <w:szCs w:val="28"/>
-          <w:lang w:eastAsia="ru-RU"/>
-        </w:rPr>
-        <w:t>Расхождение фактического наличия и учёта.</w:t>
-      </w:r>
-    </w:p>
-    <w:p>
-      <w:pPr>
-        <w:shd w:val="clear" w:color="auto" w:fill="FFFFFF"/>
-        <w:spacing w:after="0" w:line="360" w:lineRule="auto"/>
-        <w:ind w:left="708" w:firstLine="709"/>
-        <w:contextualSpacing/>
-        <w:jc w:val="both"/>
-        <w:rPr>
-          <w:rFonts w:ascii="Times New Roman" w:eastAsia="Times New Roman" w:hAnsi="Times New Roman" w:cs="Times New Roman"/>
-          <w:color w:val="222222"/>
-          <w:sz w:val="28"/>
-          <w:szCs w:val="28"/>
-          <w:lang w:eastAsia="ru-RU"/>
-        </w:rPr>
-      </w:pPr>
-      <w:r>
-        <w:rPr>
-          <w:rFonts w:ascii="Times New Roman" w:eastAsia="Times New Roman" w:hAnsi="Times New Roman" w:cs="Times New Roman"/>
-          <w:color w:val="222222"/>
-          <w:sz w:val="28"/>
-          <w:szCs w:val="28"/>
-          <w:lang w:eastAsia="ru-RU"/>
-        </w:rPr>
-        <w:t>Позднее выявление перерасхода.</w:t>
-      </w:r>
-    </w:p>
-    <w:p>
-      <w:pPr>
-        <w:shd w:val="clear" w:color="auto" w:fill="FFFFFF"/>
-        <w:spacing w:after="0" w:line="360" w:lineRule="auto"/>
-        <w:ind w:left="708" w:firstLine="709"/>
-        <w:contextualSpacing/>
-        <w:jc w:val="both"/>
-        <w:rPr>
-          <w:rFonts w:ascii="Times New Roman" w:eastAsia="Times New Roman" w:hAnsi="Times New Roman" w:cs="Times New Roman"/>
-          <w:color w:val="222222"/>
-          <w:sz w:val="28"/>
-          <w:szCs w:val="28"/>
-          <w:lang w:eastAsia="ru-RU"/>
-        </w:rPr>
-      </w:pPr>
-      <w:r>
-        <w:rPr>
-          <w:rFonts w:ascii="Times New Roman" w:eastAsia="Times New Roman" w:hAnsi="Times New Roman" w:cs="Times New Roman"/>
-          <w:color w:val="222222"/>
-          <w:sz w:val="28"/>
-          <w:szCs w:val="28"/>
-          <w:lang w:eastAsia="ru-RU"/>
-        </w:rPr>
-        <w:t>Потеря документов, двойной ввод.</w:t>
-      </w:r>
-    </w:p>
-    <w:p>
-      <w:pPr>
-        <w:shd w:val="clear" w:color="auto" w:fill="FFFFFF"/>
-        <w:spacing w:after="0" w:line="360" w:lineRule="auto"/>
-        <w:ind w:left="708" w:firstLine="709"/>
-        <w:contextualSpacing/>
-        <w:jc w:val="both"/>
-        <w:rPr>
-          <w:rFonts w:ascii="Times New Roman" w:eastAsia="Times New Roman" w:hAnsi="Times New Roman" w:cs="Times New Roman"/>
-          <w:color w:val="222222"/>
-          <w:sz w:val="28"/>
-          <w:szCs w:val="28"/>
-          <w:lang w:eastAsia="ru-RU"/>
-        </w:rPr>
-      </w:pPr>
-      <w:r>
-        <w:rPr>
-          <w:rFonts w:ascii="Times New Roman" w:eastAsia="Times New Roman" w:hAnsi="Times New Roman" w:cs="Times New Roman"/>
-          <w:color w:val="222222"/>
-          <w:sz w:val="28"/>
-          <w:szCs w:val="28"/>
-          <w:lang w:eastAsia="ru-RU"/>
-        </w:rPr>
-        <w:t>Нет онлайн-остатков по объектам.</w:t>
-      </w:r>
-    </w:p>
-    <w:p>
-      <w:pPr>
-        <w:shd w:val="clear" w:color="auto" w:fill="FFFFFF"/>
-        <w:spacing w:after="0" w:line="360" w:lineRule="auto"/>
-        <w:ind w:firstLine="709"/>
-        <w:contextualSpacing/>
-        <w:jc w:val="both"/>
-        <w:rPr>
-          <w:rFonts w:ascii="Times New Roman" w:eastAsia="Times New Roman" w:hAnsi="Times New Roman" w:cs="Times New Roman"/>
-          <w:b/>
-          <w:color w:val="222222"/>
-          <w:sz w:val="28"/>
-          <w:szCs w:val="28"/>
-          <w:lang w:eastAsia="ru-RU"/>
-        </w:rPr>
-      </w:pPr>
-      <w:r>
-        <w:rPr>
-          <w:rFonts w:ascii="Times New Roman" w:eastAsia="Times New Roman" w:hAnsi="Times New Roman" w:cs="Times New Roman"/>
-          <w:b/>
-          <w:color w:val="222222"/>
-          <w:sz w:val="28"/>
-          <w:szCs w:val="28"/>
-          <w:lang w:eastAsia="ru-RU"/>
-        </w:rPr>
-        <w:t>2.3. Процесс TO-BE:</w:t>
-      </w:r>
-    </w:p>
-    <w:p>
-      <w:pPr>
-        <w:shd w:val="clear" w:color="auto" w:fill="FFFFFF"/>
-        <w:spacing w:after="0" w:line="360" w:lineRule="auto"/>
-        <w:ind w:left="708" w:firstLine="709"/>
-        <w:contextualSpacing/>
-        <w:jc w:val="both"/>
-        <w:rPr>
-          <w:rFonts w:ascii="Times New Roman" w:eastAsia="Times New Roman" w:hAnsi="Times New Roman" w:cs="Times New Roman"/>
-          <w:color w:val="222222"/>
-          <w:sz w:val="28"/>
-          <w:szCs w:val="28"/>
-          <w:lang w:eastAsia="ru-RU"/>
-        </w:rPr>
-      </w:pPr>
-      <w:r>
-        <w:rPr>
-          <w:rFonts w:ascii="Times New Roman" w:eastAsia="Times New Roman" w:hAnsi="Times New Roman" w:cs="Times New Roman"/>
-          <w:color w:val="222222"/>
-          <w:sz w:val="28"/>
-          <w:szCs w:val="28"/>
-          <w:lang w:eastAsia="ru-RU"/>
-        </w:rPr>
-        <w:t>1. Заявки в системе с согласованием.</w:t>
-      </w:r>
-    </w:p>
-    <w:p>
-      <w:pPr>
-        <w:shd w:val="clear" w:color="auto" w:fill="FFFFFF"/>
-        <w:spacing w:after="0" w:line="360" w:lineRule="auto"/>
-        <w:ind w:left="708" w:firstLine="709"/>
-        <w:contextualSpacing/>
-        <w:jc w:val="both"/>
-        <w:rPr>
-          <w:rFonts w:ascii="Times New Roman" w:eastAsia="Times New Roman" w:hAnsi="Times New Roman" w:cs="Times New Roman"/>
-          <w:color w:val="222222"/>
-          <w:sz w:val="28"/>
-          <w:szCs w:val="28"/>
-          <w:lang w:eastAsia="ru-RU"/>
-        </w:rPr>
-      </w:pPr>
-      <w:r>
-        <w:rPr>
-          <w:rFonts w:ascii="Times New Roman" w:eastAsia="Times New Roman" w:hAnsi="Times New Roman" w:cs="Times New Roman"/>
-          <w:color w:val="222222"/>
-          <w:sz w:val="28"/>
-          <w:szCs w:val="28"/>
-          <w:lang w:eastAsia="ru-RU"/>
-        </w:rPr>
-        <w:t>2. Приёмка по электронным накладным с привязкой к объекту.</w:t>
-      </w:r>
-    </w:p>
-    <w:p>
-      <w:pPr>
-        <w:shd w:val="clear" w:color="auto" w:fill="FFFFFF"/>
-        <w:spacing w:after="0" w:line="360" w:lineRule="auto"/>
-        <w:ind w:left="708" w:firstLine="709"/>
-        <w:contextualSpacing/>
-        <w:jc w:val="both"/>
-        <w:rPr>
-          <w:rFonts w:ascii="Times New Roman" w:eastAsia="Times New Roman" w:hAnsi="Times New Roman" w:cs="Times New Roman"/>
-          <w:color w:val="222222"/>
-          <w:sz w:val="28"/>
-          <w:szCs w:val="28"/>
-          <w:lang w:eastAsia="ru-RU"/>
-        </w:rPr>
-      </w:pPr>
-      <w:r>
-        <w:rPr>
-          <w:rFonts w:ascii="Times New Roman" w:eastAsia="Times New Roman" w:hAnsi="Times New Roman" w:cs="Times New Roman"/>
-          <w:color w:val="222222"/>
-          <w:sz w:val="28"/>
-          <w:szCs w:val="28"/>
-          <w:lang w:eastAsia="ru-RU"/>
-        </w:rPr>
-        <w:t>3. Ежедневная фиксация расхода прорабом.</w:t>
-      </w:r>
-    </w:p>
-    <w:p>
-      <w:pPr>
-        <w:shd w:val="clear" w:color="auto" w:fill="FFFFFF"/>
-        <w:spacing w:after="0" w:line="360" w:lineRule="auto"/>
-        <w:ind w:left="708" w:firstLine="709"/>
-        <w:contextualSpacing/>
-        <w:jc w:val="both"/>
-        <w:rPr>
-          <w:rFonts w:ascii="Times New Roman" w:eastAsia="Times New Roman" w:hAnsi="Times New Roman" w:cs="Times New Roman"/>
-          <w:color w:val="222222"/>
-          <w:sz w:val="28"/>
-          <w:szCs w:val="28"/>
-          <w:lang w:eastAsia="ru-RU"/>
-        </w:rPr>
-      </w:pPr>
-      <w:r>
-        <w:rPr>
-          <w:rFonts w:ascii="Times New Roman" w:eastAsia="Times New Roman" w:hAnsi="Times New Roman" w:cs="Times New Roman"/>
-          <w:color w:val="222222"/>
-          <w:sz w:val="28"/>
-          <w:szCs w:val="28"/>
-          <w:lang w:eastAsia="ru-RU"/>
-        </w:rPr>
-        <w:t>4. Автоматическое формирование актов списания (М-29).</w:t>
-      </w:r>
-    </w:p>
-    <w:p>
-      <w:pPr>
-        <w:shd w:val="clear" w:color="auto" w:fill="FFFFFF"/>
-        <w:spacing w:after="0" w:line="360" w:lineRule="auto"/>
-        <w:ind w:left="708" w:firstLine="709"/>
-        <w:contextualSpacing/>
-        <w:jc w:val="both"/>
-        <w:rPr>
-          <w:rFonts w:ascii="Times New Roman" w:eastAsia="Times New Roman" w:hAnsi="Times New Roman" w:cs="Times New Roman"/>
-          <w:color w:val="222222"/>
-          <w:sz w:val="28"/>
-          <w:szCs w:val="28"/>
-          <w:lang w:eastAsia="ru-RU"/>
-        </w:rPr>
-      </w:pPr>
-      <w:r>
-        <w:rPr>
-          <w:rFonts w:ascii="Times New Roman" w:eastAsia="Times New Roman" w:hAnsi="Times New Roman" w:cs="Times New Roman"/>
-          <w:color w:val="222222"/>
-          <w:sz w:val="28"/>
-          <w:szCs w:val="28"/>
-          <w:lang w:eastAsia="ru-RU"/>
-        </w:rPr>
-        <w:t>5. Онлайн-остатки и автоматическая отчётность.</w:t>
-      </w:r>
-    </w:p>
-    <w:p>
-      <w:pPr>
-        <w:shd w:val="clear" w:color="auto" w:fill="FFFFFF"/>
-        <w:spacing w:after="0" w:line="360" w:lineRule="auto"/>
-        <w:ind w:firstLine="709"/>
-        <w:contextualSpacing/>
-        <w:jc w:val="both"/>
-        <w:rPr>
-          <w:rFonts w:ascii="Times New Roman" w:eastAsia="Times New Roman" w:hAnsi="Times New Roman" w:cs="Times New Roman"/>
-          <w:b/>
-          <w:color w:val="222222"/>
-          <w:sz w:val="28"/>
-          <w:szCs w:val="28"/>
-          <w:lang w:eastAsia="ru-RU"/>
-        </w:rPr>
-      </w:pPr>
-      <w:r>
-        <w:rPr>
-          <w:rFonts w:ascii="Times New Roman" w:eastAsia="Times New Roman" w:hAnsi="Times New Roman" w:cs="Times New Roman"/>
-          <w:b/>
-          <w:color w:val="222222"/>
-          <w:sz w:val="28"/>
-          <w:szCs w:val="28"/>
-          <w:lang w:eastAsia="ru-RU"/>
-        </w:rPr>
-        <w:t>2.4. Задачи системы:</w:t>
-      </w:r>
-    </w:p>
-    <w:p>
-      <w:pPr>
-        <w:shd w:val="clear" w:color="auto" w:fill="FFFFFF"/>
-        <w:spacing w:after="0" w:line="360" w:lineRule="auto"/>
-        <w:ind w:left="708" w:firstLine="709"/>
-        <w:contextualSpacing/>
-        <w:rPr>
-          <w:rFonts w:ascii="Times New Roman" w:eastAsia="Times New Roman" w:hAnsi="Times New Roman" w:cs="Times New Roman"/>
-          <w:color w:val="222222"/>
-          <w:sz w:val="28"/>
-          <w:szCs w:val="28"/>
-          <w:lang w:eastAsia="ru-RU"/>
-        </w:rPr>
-      </w:pPr>
-      <w:r>
-        <w:rPr>
-          <w:rFonts w:ascii="Times New Roman" w:eastAsia="Times New Roman" w:hAnsi="Times New Roman" w:cs="Times New Roman"/>
-          <w:color w:val="222222"/>
-          <w:sz w:val="28"/>
-          <w:szCs w:val="28"/>
-          <w:lang w:eastAsia="ru-RU"/>
-        </w:rPr>
-        <w:t>1. Справочники (материалы, склады, объекты, сотрудники).</w:t>
-      </w:r>
-    </w:p>
-    <w:p>
-      <w:pPr>
-        <w:shd w:val="clear" w:color="auto" w:fill="FFFFFF"/>
-        <w:spacing w:after="0" w:line="360" w:lineRule="auto"/>
-        <w:ind w:left="708" w:firstLine="709"/>
-        <w:contextualSpacing/>
-        <w:rPr>
-          <w:rFonts w:ascii="Times New Roman" w:eastAsia="Times New Roman" w:hAnsi="Times New Roman" w:cs="Times New Roman"/>
-          <w:color w:val="222222"/>
-          <w:sz w:val="28"/>
-          <w:szCs w:val="28"/>
-          <w:lang w:eastAsia="ru-RU"/>
-        </w:rPr>
-      </w:pPr>
-      <w:r>
-        <w:rPr>
-          <w:rFonts w:ascii="Times New Roman" w:eastAsia="Times New Roman" w:hAnsi="Times New Roman" w:cs="Times New Roman"/>
-          <w:color w:val="222222"/>
-          <w:sz w:val="28"/>
-          <w:szCs w:val="28"/>
-          <w:lang w:eastAsia="ru-RU"/>
-        </w:rPr>
-        <w:t>2. Заявки и согласование.</w:t>
-      </w:r>
-    </w:p>
-    <w:p>
-      <w:pPr>
-        <w:shd w:val="clear" w:color="auto" w:fill="FFFFFF"/>
-        <w:spacing w:after="0" w:line="360" w:lineRule="auto"/>
-        <w:ind w:left="708" w:firstLine="709"/>
-        <w:contextualSpacing/>
-        <w:rPr>
-          <w:rFonts w:ascii="Times New Roman" w:eastAsia="Times New Roman" w:hAnsi="Times New Roman" w:cs="Times New Roman"/>
-          <w:color w:val="222222"/>
-          <w:sz w:val="28"/>
-          <w:szCs w:val="28"/>
-          <w:lang w:eastAsia="ru-RU"/>
-        </w:rPr>
-      </w:pPr>
-      <w:r>
-        <w:rPr>
-          <w:rFonts w:ascii="Times New Roman" w:eastAsia="Times New Roman" w:hAnsi="Times New Roman" w:cs="Times New Roman"/>
-          <w:color w:val="222222"/>
-          <w:sz w:val="28"/>
-          <w:szCs w:val="28"/>
-          <w:lang w:eastAsia="ru-RU"/>
-        </w:rPr>
-        <w:t>3. Учёт прихода, расхода, перемещения.</w:t>
-      </w:r>
-    </w:p>
-    <w:p>
-      <w:pPr>
-        <w:shd w:val="clear" w:color="auto" w:fill="FFFFFF"/>
-        <w:spacing w:after="0" w:line="360" w:lineRule="auto"/>
-        <w:ind w:left="708" w:firstLine="709"/>
-        <w:contextualSpacing/>
-        <w:rPr>
-          <w:rFonts w:ascii="Times New Roman" w:eastAsia="Times New Roman" w:hAnsi="Times New Roman" w:cs="Times New Roman"/>
-          <w:color w:val="222222"/>
-          <w:sz w:val="28"/>
-          <w:szCs w:val="28"/>
-          <w:lang w:eastAsia="ru-RU"/>
-        </w:rPr>
-      </w:pPr>
-      <w:r>
-        <w:rPr>
-          <w:rFonts w:ascii="Times New Roman" w:eastAsia="Times New Roman" w:hAnsi="Times New Roman" w:cs="Times New Roman"/>
-          <w:color w:val="222222"/>
-          <w:sz w:val="28"/>
-          <w:szCs w:val="28"/>
-          <w:lang w:eastAsia="ru-RU"/>
-        </w:rPr>
-        <w:t>4. Отчётность (остатки, расход по объекту, сравнение с нормами).</w:t>
-      </w:r>
-    </w:p>
-    <w:p>
-      <w:pPr>
-        <w:shd w:val="clear" w:color="auto" w:fill="FFFFFF"/>
-        <w:spacing w:after="0" w:line="360" w:lineRule="auto"/>
-        <w:ind w:left="708" w:firstLine="709"/>
-        <w:contextualSpacing/>
-        <w:rPr>
-          <w:rFonts w:ascii="Times New Roman" w:eastAsia="Times New Roman" w:hAnsi="Times New Roman" w:cs="Times New Roman"/>
-          <w:color w:val="222222"/>
-          <w:sz w:val="28"/>
-          <w:szCs w:val="28"/>
-          <w:lang w:eastAsia="ru-RU"/>
-        </w:rPr>
-      </w:pPr>
-      <w:r>
-        <w:rPr>
-          <w:rFonts w:ascii="Times New Roman" w:eastAsia="Times New Roman" w:hAnsi="Times New Roman" w:cs="Times New Roman"/>
-          <w:color w:val="222222"/>
-          <w:sz w:val="28"/>
-          <w:szCs w:val="28"/>
-          <w:lang w:eastAsia="ru-RU"/>
-        </w:rPr>
-        <w:t>5. Права доступа (прораб — только свой объект).</w:t>
-      </w:r>
-    </w:p>
-    <w:p>
-      <w:pPr>
-        <w:shd w:val="clear" w:color="auto" w:fill="FFFFFF"/>
-        <w:spacing w:after="0" w:line="360" w:lineRule="auto"/>
-        <w:ind w:left="708" w:firstLine="709"/>
-        <w:contextualSpacing/>
-        <w:rPr>
-          <w:rFonts w:ascii="Times New Roman" w:eastAsia="Times New Roman" w:hAnsi="Times New Roman" w:cs="Times New Roman"/>
-          <w:color w:val="222222"/>
-          <w:sz w:val="28"/>
-          <w:szCs w:val="28"/>
-          <w:lang w:eastAsia="ru-RU"/>
-        </w:rPr>
-      </w:pPr>
-      <w:r>
-        <w:rPr>
-          <w:rFonts w:ascii="Times New Roman" w:eastAsia="Times New Roman" w:hAnsi="Times New Roman" w:cs="Times New Roman"/>
-          <w:color w:val="222222"/>
-          <w:sz w:val="28"/>
-          <w:szCs w:val="28"/>
-          <w:lang w:eastAsia="ru-RU"/>
-        </w:rPr>
-        <w:t>6. Экспорт для бухучёта.</w:t>
-      </w:r>
-    </w:p>
-    <w:p>
-      <w:pPr>
-        <w:shd w:val="clear" w:color="auto" w:fill="FFFFFF"/>
-        <w:spacing w:after="0" w:line="360" w:lineRule="auto"/>
-        <w:ind w:firstLine="709"/>
-        <w:contextualSpacing/>
-        <w:jc w:val="both"/>
-        <w:rPr>
-          <w:rFonts w:ascii="Times New Roman" w:eastAsia="Times New Roman" w:hAnsi="Times New Roman" w:cs="Times New Roman"/>
-          <w:color w:val="222222"/>
-          <w:sz w:val="28"/>
-          <w:szCs w:val="28"/>
-          <w:lang w:eastAsia="ru-RU"/>
-        </w:rPr>
-      </w:pPr>
-      <w:r>
-        <w:rPr>
-          <w:rFonts w:ascii="Times New Roman" w:eastAsia="Times New Roman" w:hAnsi="Times New Roman" w:cs="Times New Roman"/>
-          <w:b/>
-          <w:color w:val="222222"/>
-          <w:sz w:val="28"/>
-          <w:szCs w:val="28"/>
-          <w:lang w:eastAsia="ru-RU"/>
-        </w:rPr>
-        <w:lastRenderedPageBreak/>
-        <w:t>2.5. Ожидаемый результат</w:t>
-      </w:r>
-      <w:r>
-        <w:rPr>
-          <w:rFonts w:ascii="Times New Roman" w:eastAsia="Times New Roman" w:hAnsi="Times New Roman" w:cs="Times New Roman"/>
-          <w:color w:val="222222"/>
-          <w:sz w:val="28"/>
-          <w:szCs w:val="28"/>
-          <w:lang w:eastAsia="ru-RU"/>
-        </w:rPr>
-        <w:t>: снижение перерасхода, ускорение документооборота, прозрачность движения материалов</w:t>
-      </w:r>
-      <w:r>
-        <w:rPr>
-          <w:rFonts w:ascii="Times New Roman" w:eastAsia="Times New Roman" w:hAnsi="Times New Roman" w:cs="Times New Roman"/>
-          <w:color w:val="222222"/>
-          <w:sz w:val="28"/>
-          <w:szCs w:val="28"/>
-          <w:lang w:eastAsia="ru-RU"/>
-        </w:rPr>
-        <w:t xml:space="preserve"> от заявки до списания</w:t>
-      </w:r>
-      <w:r>
-        <w:rPr>
-          <w:rFonts w:ascii="Times New Roman" w:eastAsia="Times New Roman" w:hAnsi="Times New Roman" w:cs="Times New Roman"/>
-          <w:color w:val="222222"/>
-          <w:sz w:val="28"/>
-          <w:szCs w:val="28"/>
-          <w:lang w:eastAsia="ru-RU"/>
-        </w:rPr>
-        <w:t>.</w:t>
-      </w:r>
-    </w:p>
-    <w:p>
-      <w:pPr>
-        <w:shd w:val="clear" w:color="auto" w:fill="FFFFFF"/>
-        <w:spacing w:after="0" w:line="360" w:lineRule="auto"/>
-        <w:ind w:firstLine="709"/>
-        <w:contextualSpacing/>
-        <w:jc w:val="center"/>
-        <w:rPr>
-          <w:rFonts w:ascii="Times New Roman" w:eastAsia="Times New Roman" w:hAnsi="Times New Roman" w:cs="Times New Roman"/>
-          <w:b/>
-          <w:color w:val="222222"/>
-          <w:sz w:val="28"/>
-          <w:szCs w:val="28"/>
-          <w:lang w:eastAsia="ru-RU"/>
-        </w:rPr>
-      </w:pPr>
-      <w:r>
-        <w:rPr>
-          <w:rFonts w:ascii="Times New Roman" w:eastAsia="Times New Roman" w:hAnsi="Times New Roman" w:cs="Times New Roman"/>
-          <w:b/>
-          <w:color w:val="222222"/>
-          <w:sz w:val="28"/>
-          <w:szCs w:val="28"/>
-          <w:lang w:eastAsia="ru-RU"/>
-        </w:rPr>
-        <w:t>3. ОРГАНИЗАЦИОННАЯ СТРУКТУРА ПРЕПРИЯТИЯ</w:t>
-      </w:r>
-    </w:p>
-    <w:p>
-      <w:pPr>
-        <w:shd w:val="clear" w:color="auto" w:fill="FFFFFF"/>
-        <w:spacing w:after="0" w:line="360" w:lineRule="auto"/>
-        <w:ind w:firstLine="709"/>
-        <w:contextualSpacing/>
-        <w:rPr>
-          <w:rFonts w:ascii="Times New Roman" w:eastAsia="Times New Roman" w:hAnsi="Times New Roman" w:cs="Times New Roman"/>
-          <w:b/>
-          <w:color w:val="222222"/>
-          <w:sz w:val="28"/>
-          <w:szCs w:val="28"/>
-          <w:lang w:eastAsia="ru-RU"/>
-        </w:rPr>
-      </w:pPr>
-      <w:r>
-        <w:rPr>
-          <w:rFonts w:ascii="Times New Roman" w:eastAsia="Times New Roman" w:hAnsi="Times New Roman" w:cs="Times New Roman"/>
-          <w:b/>
-          <w:color w:val="222222"/>
-          <w:sz w:val="28"/>
-          <w:szCs w:val="28"/>
-          <w:lang w:eastAsia="ru-RU"/>
-        </w:rPr>
-        <w:t>3.1 Тип структуры.</w:t>
-      </w:r>
-    </w:p>
-    <w:p>
-      <w:pPr>
-        <w:shd w:val="clear" w:color="auto" w:fill="FFFFFF"/>
-        <w:spacing w:after="0" w:line="360" w:lineRule="auto"/>
-        <w:ind w:firstLine="709"/>
-        <w:contextualSpacing/>
-        <w:rPr>
-          <w:rFonts w:ascii="Times New Roman" w:eastAsia="Times New Roman" w:hAnsi="Times New Roman" w:cs="Times New Roman"/>
-          <w:color w:val="222222"/>
-          <w:sz w:val="28"/>
-          <w:szCs w:val="28"/>
-          <w:lang w:eastAsia="ru-RU"/>
-        </w:rPr>
-      </w:pPr>
-      <w:r>
-        <w:rPr>
-          <w:rFonts w:ascii="Times New Roman" w:eastAsia="Times New Roman" w:hAnsi="Times New Roman" w:cs="Times New Roman"/>
-          <w:color w:val="222222"/>
-          <w:sz w:val="28"/>
-          <w:szCs w:val="28"/>
-          <w:lang w:eastAsia="ru-RU"/>
-        </w:rPr>
-        <w:t>Организация имеет линейно-функциональную структуру:</w:t>
-      </w:r>
-      <w:r>
-        <w:rPr>
-          <w:rFonts w:ascii="Times New Roman" w:eastAsia="Times New Roman" w:hAnsi="Times New Roman" w:cs="Times New Roman"/>
-          <w:color w:val="222222"/>
-          <w:sz w:val="28"/>
-          <w:szCs w:val="28"/>
-          <w:lang w:eastAsia="ru-RU"/>
-        </w:rPr>
-        <w:t xml:space="preserve"> руководство осуществляет директор, ему напрямую подчиняются функциональные руководители</w:t>
-      </w:r>
-      <w:r>
-        <w:rPr>
-          <w:rFonts w:ascii="Times New Roman" w:eastAsia="Times New Roman" w:hAnsi="Times New Roman" w:cs="Times New Roman"/>
-          <w:color w:val="222222"/>
-          <w:sz w:val="28"/>
-          <w:szCs w:val="28"/>
-          <w:lang w:eastAsia="ru-RU"/>
-        </w:rPr>
-        <w:t xml:space="preserve"> (</w:t>
-      </w:r>
-      <w:r>
-        <w:rPr>
-          <w:rFonts w:ascii="Times New Roman" w:eastAsia="Times New Roman" w:hAnsi="Times New Roman" w:cs="Times New Roman"/>
-          <w:color w:val="222222"/>
-          <w:sz w:val="28"/>
-          <w:szCs w:val="28"/>
-          <w:lang w:eastAsia="ru-RU"/>
-        </w:rPr>
-        <w:t xml:space="preserve">прораб, </w:t>
-      </w:r>
-      <w:proofErr w:type="spellStart"/>
-      <w:r>
-        <w:rPr>
-          <w:rFonts w:ascii="Times New Roman" w:eastAsia="Times New Roman" w:hAnsi="Times New Roman" w:cs="Times New Roman"/>
-          <w:color w:val="222222"/>
-          <w:sz w:val="28"/>
-          <w:szCs w:val="28"/>
-          <w:lang w:eastAsia="ru-RU"/>
-        </w:rPr>
-        <w:t>снабжанец</w:t>
-      </w:r>
-      <w:proofErr w:type="spellEnd"/>
-      <w:r>
-        <w:rPr>
-          <w:rFonts w:ascii="Times New Roman" w:eastAsia="Times New Roman" w:hAnsi="Times New Roman" w:cs="Times New Roman"/>
-          <w:color w:val="222222"/>
-          <w:sz w:val="28"/>
-          <w:szCs w:val="28"/>
-          <w:lang w:eastAsia="ru-RU"/>
-        </w:rPr>
         <w:t xml:space="preserve">, </w:t>
       </w:r>
       <w:r>
@@ -1778,7 +1834,27 @@
           <w:szCs w:val="28"/>
           <w:lang w:eastAsia="ru-RU"/>
         </w:rPr>
-        <w:t xml:space="preserve">а им </w:t>
+        <w:t>а им –</w:t>
+      </w:r>
+      <w:r>
+        <w:rPr>
+          <w:rFonts w:ascii="Times New Roman" w:eastAsia="Times New Roman" w:hAnsi="Times New Roman" w:cs="Times New Roman"/>
+          <w:color w:val="222222"/>
+          <w:sz w:val="28"/>
+          <w:szCs w:val="28"/>
+          <w:lang w:eastAsia="ru-RU"/>
+        </w:rPr>
+        <w:t xml:space="preserve"> </w:t>
+      </w:r>
+      <w:r>
+        <w:rPr>
+          <w:rFonts w:ascii="Times New Roman" w:eastAsia="Times New Roman" w:hAnsi="Times New Roman" w:cs="Times New Roman"/>
+          <w:color w:val="222222"/>
+          <w:sz w:val="28"/>
+          <w:szCs w:val="28"/>
+          <w:lang w:eastAsia="ru-RU"/>
+        </w:rPr>
+        <w:t>исполнител</w:t>
       </w:r>
       <w:proofErr w:type="gramStart"/>
       <w:r>
@@ -1789,7 +1865,7 @@
           <w:szCs w:val="28"/>
           <w:lang w:eastAsia="ru-RU"/>
         </w:rPr>
-        <w:t>–и</w:t>
+        <w:t>и(</w:t>
       </w:r>
       <w:proofErr w:type="gramEnd"/>
       <w:r>
@@ -1800,7 +1876,7 @@
           <w:szCs w:val="28"/>
           <w:lang w:eastAsia="ru-RU"/>
         </w:rPr>
-        <w:t>сполнители(рабочие, кладовщик)</w:t>
+        <w:t>рабочие, кладовщик)</w:t>
       </w:r>
     </w:p>
     <w:p>
@@ -1854,8 +1930,8 @@
                 <w:rFonts w:ascii="Times New Roman" w:eastAsia="Times New Roman" w:hAnsi="Times New Roman" w:cs="Times New Roman"/>
                 <w:b/>
                 <w:color w:val="222222"/>
-                <w:sz w:val="28"/>
-                <w:szCs w:val="28"/>
+                <w:sz w:val="24"/>
+                <w:szCs w:val="24"/>
                 <w:lang w:eastAsia="ru-RU"/>
               </w:rPr>
             </w:pPr>
@@ -1864,8 +1940,8 @@
                 <w:rFonts w:ascii="Times New Roman" w:eastAsia="Times New Roman" w:hAnsi="Times New Roman" w:cs="Times New Roman"/>
                 <w:b/>
                 <w:color w:val="222222"/>
-                <w:sz w:val="28"/>
-                <w:szCs w:val="28"/>
+                <w:sz w:val="24"/>
+                <w:szCs w:val="24"/>
                 <w:lang w:eastAsia="ru-RU"/>
               </w:rPr>
               <w:t>Должность</w:t>
@@ -1885,8 +1961,8 @@
                 <w:rFonts w:ascii="Times New Roman" w:eastAsia="Times New Roman" w:hAnsi="Times New Roman" w:cs="Times New Roman"/>
                 <w:b/>
                 <w:color w:val="222222"/>
-                <w:sz w:val="28"/>
-                <w:szCs w:val="28"/>
+                <w:sz w:val="24"/>
+                <w:szCs w:val="24"/>
                 <w:lang w:eastAsia="ru-RU"/>
               </w:rPr>
             </w:pPr>
@@ -1895,8 +1971,8 @@
                 <w:rFonts w:ascii="Times New Roman" w:eastAsia="Times New Roman" w:hAnsi="Times New Roman" w:cs="Times New Roman"/>
                 <w:b/>
                 <w:color w:val="222222"/>
-                <w:sz w:val="28"/>
-                <w:szCs w:val="28"/>
+                <w:sz w:val="24"/>
+                <w:szCs w:val="24"/>
                 <w:lang w:eastAsia="ru-RU"/>
               </w:rPr>
               <w:t>Функции</w:t>
@@ -1917,15 +1993,17 @@
                 <w:rFonts w:ascii="Times New Roman" w:eastAsia="Times New Roman" w:hAnsi="Times New Roman" w:cs="Times New Roman"/>
                 <w:b/>
                 <w:color w:val="222222"/>
-                <w:sz w:val="28"/>
-                <w:szCs w:val="28"/>
+                <w:sz w:val="24"/>
+                <w:szCs w:val="24"/>
                 <w:lang w:eastAsia="ru-RU"/>
               </w:rPr>
             </w:pPr>
             <w:r>
               <w:rPr>
-                <w:rFonts w:ascii="Arial" w:hAnsi="Arial" w:cs="Arial"/>
+                <w:rFonts w:ascii="Times New Roman" w:hAnsi="Times New Roman" w:cs="Times New Roman"/>
                 <w:color w:val="222222"/>
+                <w:sz w:val="24"/>
+                <w:szCs w:val="24"/>
                 <w:shd w:val="clear" w:color="auto" w:fill="FFFFFF"/>
               </w:rPr>
               <w:t>Директор</w:t>
@@ -1944,15 +2022,17 @@
                 <w:rFonts w:ascii="Times New Roman" w:eastAsia="Times New Roman" w:hAnsi="Times New Roman" w:cs="Times New Roman"/>
                 <w:b/>
                 <w:color w:val="222222"/>
-                <w:sz w:val="28"/>
-                <w:szCs w:val="28"/>
+                <w:sz w:val="24"/>
+                <w:szCs w:val="24"/>
                 <w:lang w:eastAsia="ru-RU"/>
               </w:rPr>
             </w:pPr>
             <w:r>
               <w:rPr>
-                <w:rFonts w:ascii="Arial" w:hAnsi="Arial" w:cs="Arial"/>
+                <w:rFonts w:ascii="Times New Roman" w:hAnsi="Times New Roman" w:cs="Times New Roman"/>
                 <w:color w:val="222222"/>
+                <w:sz w:val="24"/>
+                <w:szCs w:val="24"/>
                 <w:shd w:val="clear" w:color="auto" w:fill="FFFFFF"/>
               </w:rPr>
               <w:t>Общее руководство, утверждение заявок и бюджета, контроль сроков и качества</w:t>
@@ -1972,8 +2052,8 @@
               <w:rPr>
                 <w:rFonts w:ascii="Times New Roman" w:eastAsia="Times New Roman" w:hAnsi="Times New Roman" w:cs="Times New Roman"/>
                 <w:color w:val="222222"/>
-                <w:sz w:val="28"/>
-                <w:szCs w:val="28"/>
+                <w:sz w:val="24"/>
+                <w:szCs w:val="24"/>
                 <w:lang w:eastAsia="ru-RU"/>
               </w:rPr>
             </w:pPr>
@@ -1981,8 +2061,8 @@
               <w:rPr>
                 <w:rFonts w:ascii="Times New Roman" w:eastAsia="Times New Roman" w:hAnsi="Times New Roman" w:cs="Times New Roman"/>
                 <w:color w:val="222222"/>
-                <w:sz w:val="28"/>
-                <w:szCs w:val="28"/>
+                <w:sz w:val="24"/>
+                <w:szCs w:val="24"/>
                 <w:lang w:eastAsia="ru-RU"/>
               </w:rPr>
               <w:t>Прораб</w:t>
@@ -2001,15 +2081,17 @@
                 <w:rFonts w:ascii="Times New Roman" w:eastAsia="Times New Roman" w:hAnsi="Times New Roman" w:cs="Times New Roman"/>
                 <w:b/>
                 <w:color w:val="222222"/>
-                <w:sz w:val="28"/>
-                <w:szCs w:val="28"/>
+                <w:sz w:val="24"/>
+                <w:szCs w:val="24"/>
                 <w:lang w:eastAsia="ru-RU"/>
               </w:rPr>
             </w:pPr>
             <w:r>
               <w:rPr>
-                <w:rFonts w:ascii="Arial" w:hAnsi="Arial" w:cs="Arial"/>
+                <w:rFonts w:ascii="Times New Roman" w:hAnsi="Times New Roman" w:cs="Times New Roman"/>
                 <w:color w:val="222222"/>
+                <w:sz w:val="24"/>
+                <w:szCs w:val="24"/>
                 <w:shd w:val="clear" w:color="auto" w:fill="FFFFFF"/>
               </w:rPr>
               <w:t>Организация работ на объекте, заявки на материалы, контроль расхода, приёмка работ</w:t>
@@ -2029,8 +2111,8 @@
               <w:rPr>
                 <w:rFonts w:ascii="Times New Roman" w:eastAsia="Times New Roman" w:hAnsi="Times New Roman" w:cs="Times New Roman"/>
                 <w:color w:val="222222"/>
-                <w:sz w:val="28"/>
-                <w:szCs w:val="28"/>
+                <w:sz w:val="24"/>
+                <w:szCs w:val="24"/>
                 <w:lang w:eastAsia="ru-RU"/>
               </w:rPr>
             </w:pPr>
@@ -2039,8 +2121,8 @@
               <w:rPr>
                 <w:rFonts w:ascii="Times New Roman" w:eastAsia="Times New Roman" w:hAnsi="Times New Roman" w:cs="Times New Roman"/>
                 <w:color w:val="222222"/>
-                <w:sz w:val="28"/>
-                <w:szCs w:val="28"/>
+                <w:sz w:val="24"/>
+                <w:szCs w:val="24"/>
                 <w:lang w:eastAsia="ru-RU"/>
               </w:rPr>
               <w:t>Снабжанец</w:t>
@@ -2060,19 +2142,33 @@
                 <w:rFonts w:ascii="Times New Roman" w:eastAsia="Times New Roman" w:hAnsi="Times New Roman" w:cs="Times New Roman"/>
                 <w:b/>
                 <w:color w:val="222222"/>
-                <w:sz w:val="28"/>
-                <w:szCs w:val="28"/>
+                <w:sz w:val="24"/>
+                <w:szCs w:val="24"/>
                 <w:lang w:eastAsia="ru-RU"/>
               </w:rPr>
             </w:pPr>
             <w:r>
               <w:rPr>
-                <w:rFonts w:ascii="Arial" w:hAnsi="Arial" w:cs="Arial"/>
+                <w:rFonts w:ascii="Times New Roman" w:hAnsi="Times New Roman" w:cs="Times New Roman"/>
                 <w:color w:val="222222"/>
+                <w:sz w:val="24"/>
+                <w:szCs w:val="24"/>
                 <w:shd w:val="clear" w:color="auto" w:fill="FFFFFF"/>
               </w:rPr>
-              <w:t>Закупка материалов и оборудования, работа с поставщиками, контроль поставок</w:t>
+              <w:t>З</w:t>
             </w:r>
+            <w:bookmarkStart w:id="0" w:name="_GoBack"/>
+            <w:r>
+              <w:rPr>
+                <w:rFonts w:ascii="Times New Roman" w:hAnsi="Times New Roman" w:cs="Times New Roman"/>
+                <w:color w:val="222222"/>
+                <w:sz w:val="24"/>
+                <w:szCs w:val="24"/>
+                <w:shd w:val="clear" w:color="auto" w:fill="FFFFFF"/>
+              </w:rPr>
+              <w:t>акупка материалов и оборудования, работа с поставщиками, контроль поставок</w:t>
+            </w:r>
+            <w:bookmarkEnd w:id="0"/>
           </w:p>
         </w:tc>
       </w:tr>
@@ -2088,8 +2184,8 @@
               <w:rPr>
                 <w:rFonts w:ascii="Times New Roman" w:eastAsia="Times New Roman" w:hAnsi="Times New Roman" w:cs="Times New Roman"/>
                 <w:color w:val="222222"/>
-                <w:sz w:val="28"/>
-                <w:szCs w:val="28"/>
+                <w:sz w:val="24"/>
+                <w:szCs w:val="24"/>
                 <w:lang w:eastAsia="ru-RU"/>
               </w:rPr>
             </w:pPr>
@@ -2097,8 +2193,8 @@
               <w:rPr>
                 <w:rFonts w:ascii="Times New Roman" w:eastAsia="Times New Roman" w:hAnsi="Times New Roman" w:cs="Times New Roman"/>
                 <w:color w:val="222222"/>
-                <w:sz w:val="28"/>
-                <w:szCs w:val="28"/>
+                <w:sz w:val="24"/>
+                <w:szCs w:val="24"/>
                 <w:lang w:eastAsia="ru-RU"/>
               </w:rPr>
               <w:t>Бухгалтер</w:t>
@@ -2117,15 +2213,17 @@
                 <w:rFonts w:ascii="Times New Roman" w:eastAsia="Times New Roman" w:hAnsi="Times New Roman" w:cs="Times New Roman"/>
                 <w:b/>
                 <w:color w:val="222222"/>
-                <w:sz w:val="28"/>
-                <w:szCs w:val="28"/>
+                <w:sz w:val="24"/>
+                <w:szCs w:val="24"/>
                 <w:lang w:eastAsia="ru-RU"/>
               </w:rPr>
             </w:pPr>
             <w:r>
               <w:rPr>
-                <w:rFonts w:ascii="Arial" w:hAnsi="Arial" w:cs="Arial"/>
+                <w:rFonts w:ascii="Times New Roman" w:hAnsi="Times New Roman" w:cs="Times New Roman"/>
                 <w:color w:val="222222"/>
+                <w:sz w:val="24"/>
+                <w:szCs w:val="24"/>
                 <w:shd w:val="clear" w:color="auto" w:fill="FFFFFF"/>
               </w:rPr>
               <w:t>Оприходование и списание материалов, сверка остатков, отчётность</w:t>
@@ -2145,8 +2243,8 @@
               <w:rPr>
                 <w:rFonts w:ascii="Times New Roman" w:eastAsia="Times New Roman" w:hAnsi="Times New Roman" w:cs="Times New Roman"/>
                 <w:color w:val="222222"/>
-                <w:sz w:val="28"/>
-                <w:szCs w:val="28"/>
+                <w:sz w:val="24"/>
+                <w:szCs w:val="24"/>
                 <w:lang w:eastAsia="ru-RU"/>
               </w:rPr>
             </w:pPr>
@@ -2154,8 +2252,8 @@
               <w:rPr>
                 <w:rFonts w:ascii="Times New Roman" w:eastAsia="Times New Roman" w:hAnsi="Times New Roman" w:cs="Times New Roman"/>
                 <w:color w:val="222222"/>
-                <w:sz w:val="28"/>
-                <w:szCs w:val="28"/>
+                <w:sz w:val="24"/>
+                <w:szCs w:val="24"/>
                 <w:lang w:eastAsia="ru-RU"/>
               </w:rPr>
               <w:t>Кладовщик</w:t>
@@ -2174,15 +2272,17 @@
                 <w:rFonts w:ascii="Times New Roman" w:eastAsia="Times New Roman" w:hAnsi="Times New Roman" w:cs="Times New Roman"/>
                 <w:b/>
                 <w:color w:val="222222"/>
-                <w:sz w:val="28"/>
-                <w:szCs w:val="28"/>
+                <w:sz w:val="24"/>
+                <w:szCs w:val="24"/>
                 <w:lang w:eastAsia="ru-RU"/>
               </w:rPr>
             </w:pPr>
             <w:r>
               <w:rPr>
-                <w:rFonts w:ascii="Arial" w:hAnsi="Arial" w:cs="Arial"/>
+                <w:rFonts w:ascii="Times New Roman" w:hAnsi="Times New Roman" w:cs="Times New Roman"/>
                 <w:color w:val="222222"/>
+                <w:sz w:val="24"/>
+                <w:szCs w:val="24"/>
                 <w:shd w:val="clear" w:color="auto" w:fill="FFFFFF"/>
               </w:rPr>
               <w:t>Приёмка, хранение и отпуск материалов со склада</w:t>
@@ -2202,8 +2302,8 @@
               <w:rPr>
                 <w:rFonts w:ascii="Times New Roman" w:eastAsia="Times New Roman" w:hAnsi="Times New Roman" w:cs="Times New Roman"/>
                 <w:color w:val="222222"/>
-                <w:sz w:val="28"/>
-                <w:szCs w:val="28"/>
+                <w:sz w:val="24"/>
+                <w:szCs w:val="24"/>
                 <w:lang w:eastAsia="ru-RU"/>
               </w:rPr>
             </w:pPr>
@@ -2211,8 +2311,8 @@
               <w:rPr>
                 <w:rFonts w:ascii="Times New Roman" w:eastAsia="Times New Roman" w:hAnsi="Times New Roman" w:cs="Times New Roman"/>
                 <w:color w:val="222222"/>
-                <w:sz w:val="28"/>
-                <w:szCs w:val="28"/>
+                <w:sz w:val="24"/>
+                <w:szCs w:val="24"/>
                 <w:lang w:eastAsia="ru-RU"/>
               </w:rPr>
               <w:t>Рабочие</w:t>
@@ -2231,15 +2331,17 @@
                 <w:rFonts w:ascii="Times New Roman" w:eastAsia="Times New Roman" w:hAnsi="Times New Roman" w:cs="Times New Roman"/>
                 <w:b/>
                 <w:color w:val="222222"/>
-                <w:sz w:val="28"/>
-                <w:szCs w:val="28"/>
+                <w:sz w:val="24"/>
+                <w:szCs w:val="24"/>
                 <w:lang w:eastAsia="ru-RU"/>
               </w:rPr>
             </w:pPr>
             <w:r>
               <w:rPr>
-                <w:rFonts w:ascii="Arial" w:hAnsi="Arial" w:cs="Arial"/>
+                <w:rFonts w:ascii="Times New Roman" w:hAnsi="Times New Roman" w:cs="Times New Roman"/>
                 <w:color w:val="222222"/>
+                <w:sz w:val="24"/>
+                <w:szCs w:val="24"/>
                 <w:shd w:val="clear" w:color="auto" w:fill="FFFFFF"/>
               </w:rPr>
               <w:t>Выполнение работ по гидроизоляции, монтажу оборудования, облицовке</w:t>
@@ -2247,176 +2349,182 @@
           </w:p>
         </w:tc>
       </w:tr>
+      <w:tr>
+        <w:tc>
+          <w:tcPr>
+            <w:tcW w:w="4785" w:type="dxa"/>
+          </w:tcPr>
+          <w:p>
+            <w:pPr>
+              <w:spacing w:line="360" w:lineRule="auto"/>
+              <w:contextualSpacing/>
+              <w:rPr>
+                <w:rFonts w:ascii="Times New Roman" w:eastAsia="Times New Roman" w:hAnsi="Times New Roman" w:cs="Times New Roman"/>
+                <w:color w:val="222222"/>
+                <w:sz w:val="24"/>
+                <w:szCs w:val="24"/>
+                <w:lang w:eastAsia="ru-RU"/>
+              </w:rPr>
+            </w:pPr>
+            <w:r>
+              <w:rPr>
+                <w:rFonts w:ascii="Times New Roman" w:eastAsia="Times New Roman" w:hAnsi="Times New Roman" w:cs="Times New Roman"/>
+                <w:color w:val="222222"/>
+                <w:sz w:val="24"/>
+                <w:szCs w:val="24"/>
+                <w:lang w:eastAsia="ru-RU"/>
+              </w:rPr>
+              <w:t>Инженер-сметчик</w:t>
+            </w:r>
+          </w:p>
+        </w:tc>
+        <w:tc>
+          <w:tcPr>
+            <w:tcW w:w="4786" w:type="dxa"/>
+          </w:tcPr>
+          <w:p>
+            <w:pPr>
+              <w:rPr>
+                <w:rFonts w:ascii="Times New Roman" w:eastAsia="Times New Roman" w:hAnsi="Times New Roman" w:cs="Times New Roman"/>
+                <w:sz w:val="24"/>
+                <w:szCs w:val="24"/>
+                <w:lang w:eastAsia="ru-RU"/>
+              </w:rPr>
+            </w:pPr>
+            <w:r>
+              <w:rPr>
+                <w:rFonts w:ascii="Times New Roman" w:eastAsia="Times New Roman" w:hAnsi="Times New Roman" w:cs="Times New Roman"/>
+                <w:sz w:val="24"/>
+                <w:szCs w:val="24"/>
+                <w:lang w:eastAsia="ru-RU"/>
+              </w:rPr>
+              <w:t>Формирование заявок, мониторинг рынка,</w:t>
+            </w:r>
+          </w:p>
+          <w:p>
+            <w:pPr>
+              <w:rPr>
+                <w:rFonts w:ascii="Times New Roman" w:eastAsia="Times New Roman" w:hAnsi="Times New Roman" w:cs="Times New Roman"/>
+                <w:sz w:val="24"/>
+                <w:szCs w:val="24"/>
+                <w:lang w:eastAsia="ru-RU"/>
+              </w:rPr>
+            </w:pPr>
+            <w:r>
+              <w:rPr>
+                <w:rFonts w:ascii="Times New Roman" w:eastAsia="Times New Roman" w:hAnsi="Times New Roman" w:cs="Times New Roman"/>
+                <w:sz w:val="24"/>
+                <w:szCs w:val="24"/>
+                <w:lang w:eastAsia="ru-RU"/>
+              </w:rPr>
+              <w:t>закупки, контроль поставок</w:t>
+            </w:r>
+          </w:p>
+          <w:p>
+            <w:pPr>
+              <w:rPr>
+                <w:rFonts w:ascii="Times New Roman" w:eastAsia="Times New Roman" w:hAnsi="Times New Roman" w:cs="Times New Roman"/>
+                <w:sz w:val="24"/>
+                <w:szCs w:val="24"/>
+                <w:lang w:eastAsia="ru-RU"/>
+              </w:rPr>
+            </w:pPr>
+            <w:r>
+              <w:rPr>
+                <w:rFonts w:ascii="Times New Roman" w:eastAsia="Times New Roman" w:hAnsi="Times New Roman" w:cs="Times New Roman"/>
+                <w:sz w:val="24"/>
+                <w:szCs w:val="24"/>
+                <w:lang w:eastAsia="ru-RU"/>
+              </w:rPr>
+              <w:t>финансовый контроль</w:t>
+            </w:r>
+          </w:p>
+        </w:tc>
+      </w:tr>
     </w:tbl>
     <w:p>
       <w:pPr>
         <w:shd w:val="clear" w:color="auto" w:fill="FFFFFF"/>
         <w:spacing w:after="0" w:line="360" w:lineRule="auto"/>
         <w:contextualSpacing/>
-        <w:rPr>
-          <w:rFonts w:ascii="Times New Roman" w:eastAsia="Times New Roman" w:hAnsi="Times New Roman" w:cs="Times New Roman"/>
-          <w:b/>
-          <w:color w:val="222222"/>
-          <w:sz w:val="28"/>
-          <w:szCs w:val="28"/>
-          <w:lang w:eastAsia="ru-RU"/>
-        </w:rPr>
-      </w:pPr>
-    </w:p>
-    <w:p>
-      <w:pPr>
-        <w:shd w:val="clear" w:color="auto" w:fill="FFFFFF"/>
-        <w:spacing w:after="0" w:line="360" w:lineRule="auto"/>
-        <w:ind w:firstLine="709"/>
-        <w:contextualSpacing/>
-        <w:jc w:val="both"/>
-        <w:rPr>
-          <w:rFonts w:ascii="Times New Roman" w:eastAsia="Times New Roman" w:hAnsi="Times New Roman" w:cs="Times New Roman"/>
-          <w:b/>
-          <w:color w:val="222222"/>
-          <w:sz w:val="28"/>
-          <w:szCs w:val="28"/>
-          <w:lang w:eastAsia="ru-RU"/>
-        </w:rPr>
-      </w:pPr>
-    </w:p>
-    <w:p>
-      <w:pPr>
-        <w:shd w:val="clear" w:color="auto" w:fill="FFFFFF"/>
-        <w:spacing w:after="0" w:line="360" w:lineRule="auto"/>
-        <w:ind w:firstLine="709"/>
-        <w:contextualSpacing/>
-        <w:jc w:val="both"/>
-        <w:rPr>
-          <w:rFonts w:ascii="Times New Roman" w:eastAsia="Times New Roman" w:hAnsi="Times New Roman" w:cs="Times New Roman"/>
-          <w:b/>
-          <w:color w:val="222222"/>
-          <w:sz w:val="28"/>
-          <w:szCs w:val="28"/>
-          <w:lang w:eastAsia="ru-RU"/>
-        </w:rPr>
-      </w:pPr>
-    </w:p>
-    <w:p>
-      <w:pPr>
-        <w:shd w:val="clear" w:color="auto" w:fill="FFFFFF"/>
-        <w:spacing w:after="0" w:line="360" w:lineRule="auto"/>
-        <w:ind w:firstLine="709"/>
-        <w:contextualSpacing/>
-        <w:jc w:val="both"/>
-        <w:rPr>
-          <w:rFonts w:ascii="Times New Roman" w:eastAsia="Times New Roman" w:hAnsi="Times New Roman" w:cs="Times New Roman"/>
-          <w:b/>
-          <w:color w:val="222222"/>
-          <w:sz w:val="28"/>
-          <w:szCs w:val="28"/>
-          <w:lang w:eastAsia="ru-RU"/>
-        </w:rPr>
-      </w:pPr>
-    </w:p>
-    <w:p>
-      <w:pPr>
-        <w:shd w:val="clear" w:color="auto" w:fill="FFFFFF"/>
-        <w:spacing w:after="0" w:line="360" w:lineRule="auto"/>
-        <w:ind w:firstLine="709"/>
-        <w:contextualSpacing/>
-        <w:jc w:val="both"/>
-        <w:rPr>
-          <w:rFonts w:ascii="Times New Roman" w:eastAsia="Times New Roman" w:hAnsi="Times New Roman" w:cs="Times New Roman"/>
-          <w:b/>
-          <w:color w:val="222222"/>
-          <w:sz w:val="28"/>
-          <w:szCs w:val="28"/>
-          <w:lang w:eastAsia="ru-RU"/>
-        </w:rPr>
-      </w:pPr>
-    </w:p>
-    <w:p>
-      <w:pPr>
-        <w:shd w:val="clear" w:color="auto" w:fill="FFFFFF"/>
-        <w:spacing w:after="0" w:line="360" w:lineRule="auto"/>
-        <w:ind w:firstLine="709"/>
-        <w:contextualSpacing/>
-        <w:jc w:val="both"/>
-        <w:rPr>
-          <w:rFonts w:ascii="Times New Roman" w:eastAsia="Times New Roman" w:hAnsi="Times New Roman" w:cs="Times New Roman"/>
-          <w:b/>
-          <w:color w:val="222222"/>
-          <w:sz w:val="28"/>
-          <w:szCs w:val="28"/>
-          <w:lang w:eastAsia="ru-RU"/>
-        </w:rPr>
-      </w:pPr>
-    </w:p>
-    <w:p>
-      <w:pPr>
-        <w:shd w:val="clear" w:color="auto" w:fill="FFFFFF"/>
-        <w:spacing w:after="0" w:line="360" w:lineRule="auto"/>
-        <w:ind w:firstLine="709"/>
-        <w:contextualSpacing/>
-        <w:jc w:val="both"/>
-        <w:rPr>
-          <w:rFonts w:ascii="Times New Roman" w:eastAsia="Times New Roman" w:hAnsi="Times New Roman" w:cs="Times New Roman"/>
-          <w:b/>
-          <w:color w:val="222222"/>
-          <w:sz w:val="28"/>
-          <w:szCs w:val="28"/>
-          <w:lang w:eastAsia="ru-RU"/>
-        </w:rPr>
-      </w:pPr>
-    </w:p>
-    <w:p>
-      <w:pPr>
-        <w:shd w:val="clear" w:color="auto" w:fill="FFFFFF"/>
-        <w:spacing w:after="0" w:line="360" w:lineRule="auto"/>
-        <w:ind w:firstLine="709"/>
-        <w:contextualSpacing/>
-        <w:jc w:val="both"/>
-        <w:rPr>
-          <w:rFonts w:ascii="Times New Roman" w:eastAsia="Times New Roman" w:hAnsi="Times New Roman" w:cs="Times New Roman"/>
-          <w:b/>
-          <w:color w:val="222222"/>
-          <w:sz w:val="28"/>
-          <w:szCs w:val="28"/>
-          <w:lang w:eastAsia="ru-RU"/>
-        </w:rPr>
-      </w:pPr>
-    </w:p>
-    <w:p>
-      <w:pPr>
-        <w:shd w:val="clear" w:color="auto" w:fill="FFFFFF"/>
-        <w:spacing w:after="0" w:line="360" w:lineRule="auto"/>
-        <w:ind w:firstLine="709"/>
-        <w:contextualSpacing/>
-        <w:jc w:val="both"/>
-        <w:rPr>
-          <w:rFonts w:ascii="Times New Roman" w:eastAsia="Times New Roman" w:hAnsi="Times New Roman" w:cs="Times New Roman"/>
-          <w:b/>
-          <w:color w:val="222222"/>
-          <w:sz w:val="28"/>
-          <w:szCs w:val="28"/>
-          <w:lang w:eastAsia="ru-RU"/>
-        </w:rPr>
-      </w:pPr>
-    </w:p>
-    <w:p>
-      <w:pPr>
-        <w:shd w:val="clear" w:color="auto" w:fill="FFFFFF"/>
-        <w:spacing w:after="0" w:line="360" w:lineRule="auto"/>
-        <w:ind w:firstLine="709"/>
-        <w:contextualSpacing/>
-        <w:jc w:val="both"/>
-        <w:rPr>
-          <w:rFonts w:ascii="Times New Roman" w:eastAsia="Times New Roman" w:hAnsi="Times New Roman" w:cs="Times New Roman"/>
-          <w:b/>
-          <w:color w:val="222222"/>
-          <w:sz w:val="28"/>
-          <w:szCs w:val="28"/>
-          <w:lang w:eastAsia="ru-RU"/>
-        </w:rPr>
-      </w:pPr>
-      <w:bookmarkStart w:id="0" w:name="_GoBack"/>
-      <w:bookmarkEnd w:id="0"/>
+        <w:jc w:val="both"/>
+        <w:rPr>
+          <w:rFonts w:ascii="Times New Roman" w:eastAsia="Times New Roman" w:hAnsi="Times New Roman" w:cs="Times New Roman"/>
+          <w:b/>
+          <w:color w:val="222222"/>
+          <w:sz w:val="28"/>
+          <w:szCs w:val="28"/>
+          <w:lang w:eastAsia="ru-RU"/>
+        </w:rPr>
+      </w:pPr>
+    </w:p>
+    <w:p>
+      <w:pPr>
+        <w:shd w:val="clear" w:color="auto" w:fill="FFFFFF"/>
+        <w:spacing w:after="0" w:line="360" w:lineRule="auto"/>
+        <w:ind w:firstLine="708"/>
+        <w:contextualSpacing/>
+        <w:jc w:val="both"/>
+        <w:rPr>
+          <w:rFonts w:ascii="Times New Roman" w:eastAsia="Times New Roman" w:hAnsi="Times New Roman" w:cs="Times New Roman"/>
+          <w:b/>
+          <w:color w:val="222222"/>
+          <w:sz w:val="28"/>
+          <w:szCs w:val="28"/>
+          <w:lang w:eastAsia="ru-RU"/>
+        </w:rPr>
+      </w:pPr>
+    </w:p>
+    <w:p>
+      <w:pPr>
+        <w:shd w:val="clear" w:color="auto" w:fill="FFFFFF"/>
+        <w:spacing w:after="0" w:line="360" w:lineRule="auto"/>
+        <w:ind w:firstLine="708"/>
+        <w:contextualSpacing/>
+        <w:jc w:val="both"/>
+        <w:rPr>
+          <w:rFonts w:ascii="Times New Roman" w:eastAsia="Times New Roman" w:hAnsi="Times New Roman" w:cs="Times New Roman"/>
+          <w:b/>
+          <w:color w:val="222222"/>
+          <w:sz w:val="28"/>
+          <w:szCs w:val="28"/>
+          <w:lang w:eastAsia="ru-RU"/>
+        </w:rPr>
+      </w:pPr>
+    </w:p>
+    <w:p>
+      <w:pPr>
+        <w:shd w:val="clear" w:color="auto" w:fill="FFFFFF"/>
+        <w:spacing w:after="0" w:line="360" w:lineRule="auto"/>
+        <w:ind w:firstLine="708"/>
+        <w:contextualSpacing/>
+        <w:jc w:val="both"/>
+        <w:rPr>
+          <w:rFonts w:ascii="Times New Roman" w:eastAsia="Times New Roman" w:hAnsi="Times New Roman" w:cs="Times New Roman"/>
+          <w:b/>
+          <w:color w:val="222222"/>
+          <w:sz w:val="28"/>
+          <w:szCs w:val="28"/>
+          <w:lang w:eastAsia="ru-RU"/>
+        </w:rPr>
+      </w:pPr>
+    </w:p>
+    <w:p>
+      <w:pPr>
+        <w:shd w:val="clear" w:color="auto" w:fill="FFFFFF"/>
+        <w:spacing w:after="0" w:line="360" w:lineRule="auto"/>
+        <w:ind w:firstLine="708"/>
+        <w:contextualSpacing/>
+        <w:jc w:val="both"/>
+        <w:rPr>
+          <w:rFonts w:ascii="Times New Roman" w:eastAsia="Times New Roman" w:hAnsi="Times New Roman" w:cs="Times New Roman"/>
+          <w:b/>
+          <w:color w:val="222222"/>
+          <w:sz w:val="28"/>
+          <w:szCs w:val="28"/>
+          <w:lang w:eastAsia="ru-RU"/>
+        </w:rPr>
+      </w:pPr>
       <w:r>
         <w:rPr>
           <w:rFonts w:ascii="Times New Roman" w:eastAsia="Times New Roman" w:hAnsi="Times New Roman" w:cs="Times New Roman"/>
@@ -2462,8 +2570,10 @@
         <w:rPr>
           <w:rFonts w:ascii="Times New Roman" w:hAnsi="Times New Roman" w:cs="Times New Roman"/>
           <w:b/>
-          <w:sz w:val="28"/>
-          <w:szCs w:val="28"/>
+          <w:noProof/>
+          <w:sz w:val="28"/>
+          <w:szCs w:val="28"/>
+          <w:lang w:eastAsia="ru-RU"/>
         </w:rPr>
         <w:drawing>
           <wp:inline distT="0" distB="0" distL="0" distR="0" wp14:anchorId="3D5E7515" wp14:editId="72976F73">
@@ -2508,6 +2618,7 @@
         <w:jc w:val="center"/>
         <w:rPr>
           <w:rFonts w:ascii="Times New Roman" w:hAnsi="Times New Roman" w:cs="Times New Roman"/>
+          <w:i/>
           <w:color w:val="000000" w:themeColor="text1"/>
           <w:sz w:val="24"/>
           <w:szCs w:val="24"/>
@@ -2530,18 +2641,62 @@
           <w:sz w:val="24"/>
           <w:szCs w:val="24"/>
         </w:rPr>
-        <w:t xml:space="preserve"> </w:t>
-      </w:r>
-      <w:r>
+        <w:t xml:space="preserve"> Организационно управленческая структура</w:t>
+      </w:r>
+    </w:p>
+    <w:p>
+      <w:pPr>
+        <w:spacing w:after="0" w:line="360" w:lineRule="auto"/>
         <w:rPr>
           <w:rFonts w:ascii="Times New Roman" w:hAnsi="Times New Roman" w:cs="Times New Roman"/>
-          <w:i/>
+          <w:b/>
           <w:color w:val="000000" w:themeColor="text1"/>
-          <w:sz w:val="24"/>
-          <w:szCs w:val="24"/>
-        </w:rPr>
-        <w:t>Организационно управленческая структура</w:t>
-      </w:r>
+          <w:sz w:val="28"/>
+          <w:szCs w:val="28"/>
+        </w:rPr>
+      </w:pPr>
+      <w:r>
+        <w:rPr>
+          <w:rFonts w:ascii="Times New Roman" w:hAnsi="Times New Roman" w:cs="Times New Roman"/>
+          <w:b/>
+          <w:color w:val="000000" w:themeColor="text1"/>
+          <w:sz w:val="28"/>
+          <w:szCs w:val="28"/>
+        </w:rPr>
+        <w:t>Вывод</w:t>
+      </w:r>
+    </w:p>
+    <w:p>
+      <w:pPr>
+        <w:spacing w:after="0" w:line="360" w:lineRule="auto"/>
+        <w:rPr>
+          <w:rFonts w:ascii="Times New Roman" w:hAnsi="Times New Roman" w:cs="Times New Roman"/>
+          <w:color w:val="000000" w:themeColor="text1"/>
+          <w:sz w:val="28"/>
+          <w:szCs w:val="28"/>
+        </w:rPr>
+      </w:pPr>
+      <w:r>
+        <w:rPr>
+          <w:rFonts w:ascii="Times New Roman" w:hAnsi="Times New Roman" w:cs="Times New Roman"/>
+          <w:color w:val="000000" w:themeColor="text1"/>
+          <w:sz w:val="28"/>
+          <w:szCs w:val="28"/>
+        </w:rPr>
+        <w:tab/>
+        <w:t>Структура  разделяет заказ, учет и выполнение работ, но между ними нет единой информационной среды – это обосновывает автоматизацию</w:t>
+      </w:r>
+    </w:p>
+    <w:p>
+      <w:pPr>
+        <w:spacing w:after="0" w:line="360" w:lineRule="auto"/>
+        <w:rPr>
+          <w:rFonts w:ascii="Times New Roman" w:hAnsi="Times New Roman" w:cs="Times New Roman"/>
+          <w:color w:val="000000" w:themeColor="text1"/>
+          <w:sz w:val="28"/>
+          <w:szCs w:val="28"/>
+        </w:rPr>
+      </w:pPr>
     </w:p>
     <w:sectPr>
       <w:pgSz w:w="11906" w:h="16838"/>

</xml_diff>